<commit_message>
Corrige plantilla del Anexo Técnico para generación de contratos
</commit_message>
<xml_diff>
--- a/back/src/static/contratos/Anexo Técnico.docx
+++ b/back/src/static/contratos/Anexo Técnico.docx
@@ -962,7 +962,7 @@
                 </mc:Choice>
                 <mc:Fallback>
                   <w:pict>
-                    <v:group w14:anchorId="6A24EF4F" id="Group 3" o:spid="_x0000_s1026" style="position:absolute;margin-left:26.8pt;margin-top:-26.25pt;width:18.7pt;height:19.85pt;z-index:15729152;mso-wrap-distance-left:0;mso-wrap-distance-right:0" coordsize="237490,252095" o:gfxdata="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">
+                    <v:group w14:anchorId="6D4C66E7" id="Group 3" o:spid="_x0000_s1026" style="position:absolute;margin-left:26.8pt;margin-top:-26.25pt;width:18.7pt;height:19.85pt;z-index:15729152;mso-wrap-distance-left:0;mso-wrap-distance-right:0" coordsize="237490,252095" o:gfxdata="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">
                       <v:shapetype id="_x0000_t75" coordsize="21600,21600" o:spt="75" o:preferrelative="t" path="m@4@5l@4@11@9@11@9@5xe" filled="f" stroked="f">
                         <v:stroke joinstyle="miter"/>
                         <v:formulas>
@@ -1316,7 +1316,7 @@
           </mc:Choice>
           <mc:Fallback>
             <w:pict>
-              <v:shape w14:anchorId="50974F5E" id="Graphic 5" o:spid="_x0000_s1026" style="position:absolute;margin-left:85.1pt;margin-top:-176.85pt;width:441.45pt;height:164.55pt;z-index:-15995392;visibility:visible;mso-wrap-style:square;mso-wrap-distance-left:0;mso-wrap-distance-top:0;mso-wrap-distance-right:0;mso-wrap-distance-bottom:0;mso-position-horizontal:absolute;mso-position-horizontal-relative:page;mso-position-vertical:absolute;mso-position-vertical-relative:text;v-text-anchor:top" coordsize="5606415,2089785" o:gfxdata="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" path="m2802890,l,,,1475486r,614172l2802890,2089658r,-614172l2802890,xem5606237,l2802966,r,1475486l2802966,2089658r2803271,l5606237,1475486,5606237,xe" fillcolor="#d1d1d1" stroked="f">
+              <v:shape w14:anchorId="64EF3F9C" id="Graphic 5" o:spid="_x0000_s1026" style="position:absolute;margin-left:85.1pt;margin-top:-176.85pt;width:441.45pt;height:164.55pt;z-index:-15995392;visibility:visible;mso-wrap-style:square;mso-wrap-distance-left:0;mso-wrap-distance-top:0;mso-wrap-distance-right:0;mso-wrap-distance-bottom:0;mso-position-horizontal:absolute;mso-position-horizontal-relative:page;mso-position-vertical:absolute;mso-position-vertical-relative:text;v-text-anchor:top" coordsize="5606415,2089785" o:gfxdata="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" path="m2802890,l,,,1475486r,614172l2802890,2089658r,-614172l2802890,xem5606237,l2802966,r,1475486l2802966,2089658r2803271,l5606237,1475486,5606237,xe" fillcolor="#d1d1d1" stroked="f">
                 <v:path arrowok="t"/>
                 <w10:wrap anchorx="page"/>
               </v:shape>
@@ -6035,7 +6035,6 @@
         </w:rPr>
         <w:t xml:space="preserve"> </w:t>
       </w:r>
-      <w:proofErr w:type="gramStart"/>
       <w:r>
         <w:rPr>
           <w:spacing w:val="-4"/>
@@ -6043,7 +6042,6 @@
         </w:rPr>
         <w:t>Ticket</w:t>
       </w:r>
-      <w:proofErr w:type="gramEnd"/>
       <w:r>
         <w:rPr>
           <w:spacing w:val="-6"/>
@@ -6887,14 +6885,12 @@
         </w:rPr>
         <w:t xml:space="preserve"> </w:t>
       </w:r>
-      <w:proofErr w:type="gramStart"/>
       <w:r>
         <w:rPr>
           <w:sz w:val="20"/>
         </w:rPr>
         <w:t>Tickets</w:t>
       </w:r>
-      <w:proofErr w:type="gramEnd"/>
       <w:r>
         <w:rPr>
           <w:spacing w:val="-7"/>
@@ -15341,7 +15337,6 @@
         </w:rPr>
         <w:t xml:space="preserve"> </w:t>
       </w:r>
-      <w:proofErr w:type="gramStart"/>
       <w:r>
         <w:rPr>
           <w:spacing w:val="-2"/>
@@ -15363,7 +15358,6 @@
         </w:rPr>
         <w:t>,</w:t>
       </w:r>
-      <w:proofErr w:type="gramEnd"/>
       <w:r>
         <w:rPr>
           <w:spacing w:val="-15"/>
@@ -15399,7 +15393,6 @@
         </w:rPr>
         <w:t xml:space="preserve"> </w:t>
       </w:r>
-      <w:proofErr w:type="gramStart"/>
       <w:r>
         <w:rPr>
           <w:spacing w:val="-2"/>
@@ -15407,7 +15400,6 @@
         </w:rPr>
         <w:t>Ticket</w:t>
       </w:r>
-      <w:proofErr w:type="gramEnd"/>
       <w:r>
         <w:rPr>
           <w:spacing w:val="-15"/>
@@ -18707,7 +18699,6 @@
         <w:t>TipoDocumento</w:t>
       </w:r>
       <w:proofErr w:type="spellEnd"/>
-      <w:proofErr w:type="gramStart"/>
       <w:r>
         <w:rPr>
           <w:rFonts w:ascii="Tahoma"/>
@@ -18719,18 +18710,16 @@
         <w:rPr>
           <w:rFonts w:ascii="Tahoma"/>
           <w:b/>
-          <w:spacing w:val="-2"/>
-        </w:rPr>
-        <w:t>{</w:t>
-      </w:r>
-      <w:proofErr w:type="gramEnd"/>
+        </w:rPr>
+        <w:t xml:space="preserve"> </w:t>
+      </w:r>
       <w:r>
         <w:rPr>
           <w:rFonts w:ascii="Tahoma"/>
           <w:b/>
           <w:spacing w:val="-2"/>
         </w:rPr>
-        <w:t>{</w:t>
+        <w:t>{{</w:t>
       </w:r>
       <w:proofErr w:type="spellStart"/>
       <w:r>
@@ -20757,6 +20746,7 @@
   <w:style w:type="character" w:default="1" w:styleId="Fuentedeprrafopredeter">
     <w:name w:val="Default Paragraph Font"/>
     <w:uiPriority w:val="1"/>
+    <w:semiHidden/>
     <w:unhideWhenUsed/>
   </w:style>
   <w:style w:type="table" w:default="1" w:styleId="Tablanormal">

</xml_diff>

<commit_message>
Organiza la estructura de cómo se muestra la información en anexo técnico
</commit_message>
<xml_diff>
--- a/back/src/static/contratos/Anexo Técnico.docx
+++ b/back/src/static/contratos/Anexo Técnico.docx
@@ -962,7 +962,7 @@
                 </mc:Choice>
                 <mc:Fallback>
                   <w:pict>
-                    <v:group w14:anchorId="6D4C66E7" id="Group 3" o:spid="_x0000_s1026" style="position:absolute;margin-left:26.8pt;margin-top:-26.25pt;width:18.7pt;height:19.85pt;z-index:15729152;mso-wrap-distance-left:0;mso-wrap-distance-right:0" coordsize="237490,252095" o:gfxdata="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">
+                    <v:group w14:anchorId="49D6E8AE" id="Group 3" o:spid="_x0000_s1026" style="position:absolute;margin-left:26.8pt;margin-top:-26.25pt;width:18.7pt;height:19.85pt;z-index:15729152;mso-wrap-distance-left:0;mso-wrap-distance-right:0" coordsize="237490,252095" o:gfxdata="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">
                       <v:shapetype id="_x0000_t75" coordsize="21600,21600" o:spt="75" o:preferrelative="t" path="m@4@5l@4@11@9@11@9@5xe" filled="f" stroked="f">
                         <v:stroke joinstyle="miter"/>
                         <v:formulas>
@@ -1316,7 +1316,7 @@
           </mc:Choice>
           <mc:Fallback>
             <w:pict>
-              <v:shape w14:anchorId="64EF3F9C" id="Graphic 5" o:spid="_x0000_s1026" style="position:absolute;margin-left:85.1pt;margin-top:-176.85pt;width:441.45pt;height:164.55pt;z-index:-15995392;visibility:visible;mso-wrap-style:square;mso-wrap-distance-left:0;mso-wrap-distance-top:0;mso-wrap-distance-right:0;mso-wrap-distance-bottom:0;mso-position-horizontal:absolute;mso-position-horizontal-relative:page;mso-position-vertical:absolute;mso-position-vertical-relative:text;v-text-anchor:top" coordsize="5606415,2089785" o:gfxdata="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" path="m2802890,l,,,1475486r,614172l2802890,2089658r,-614172l2802890,xem5606237,l2802966,r,1475486l2802966,2089658r2803271,l5606237,1475486,5606237,xe" fillcolor="#d1d1d1" stroked="f">
+              <v:shape w14:anchorId="0F9D6B72" id="Graphic 5" o:spid="_x0000_s1026" style="position:absolute;margin-left:85.1pt;margin-top:-176.85pt;width:441.45pt;height:164.55pt;z-index:-15995392;visibility:visible;mso-wrap-style:square;mso-wrap-distance-left:0;mso-wrap-distance-top:0;mso-wrap-distance-right:0;mso-wrap-distance-bottom:0;mso-position-horizontal:absolute;mso-position-horizontal-relative:page;mso-position-vertical:absolute;mso-position-vertical-relative:text;v-text-anchor:top" coordsize="5606415,2089785" o:gfxdata="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" path="m2802890,l,,,1475486r,614172l2802890,2089658r,-614172l2802890,xem5606237,l2802966,r,1475486l2802966,2089658r2803271,l5606237,1475486,5606237,xe" fillcolor="#d1d1d1" stroked="f">
                 <v:path arrowok="t"/>
                 <w10:wrap anchorx="page"/>
               </v:shape>
@@ -18312,764 +18312,6 @@
     </w:p>
     <w:p>
       <w:pPr>
-        <w:tabs>
-          <w:tab w:val="left" w:pos="4784"/>
-        </w:tabs>
-        <w:spacing w:before="150"/>
-        <w:ind w:left="370"/>
-        <w:rPr>
-          <w:b/>
-        </w:rPr>
-      </w:pPr>
-      <w:r>
-        <w:rPr>
-          <w:b/>
-          <w:spacing w:val="-9"/>
-        </w:rPr>
-        <w:lastRenderedPageBreak/>
-        <w:t>LA</w:t>
-      </w:r>
-      <w:r>
-        <w:rPr>
-          <w:b/>
-          <w:spacing w:val="-19"/>
-        </w:rPr>
-        <w:t xml:space="preserve"> </w:t>
-      </w:r>
-      <w:r>
-        <w:rPr>
-          <w:b/>
-          <w:spacing w:val="-2"/>
-        </w:rPr>
-        <w:t>EMPRESA</w:t>
-      </w:r>
-      <w:r>
-        <w:rPr>
-          <w:b/>
-        </w:rPr>
-        <w:tab/>
-      </w:r>
-      <w:r>
-        <w:rPr>
-          <w:b/>
-          <w:spacing w:val="-6"/>
-        </w:rPr>
-        <w:t>EL</w:t>
-      </w:r>
-      <w:r>
-        <w:rPr>
-          <w:b/>
-          <w:spacing w:val="-19"/>
-        </w:rPr>
-        <w:t xml:space="preserve"> </w:t>
-      </w:r>
-      <w:r>
-        <w:rPr>
-          <w:b/>
-          <w:spacing w:val="-2"/>
-        </w:rPr>
-        <w:t>CONTRATISTA</w:t>
-      </w:r>
-    </w:p>
-    <w:p>
-      <w:pPr>
-        <w:pStyle w:val="Textoindependiente"/>
-        <w:rPr>
-          <w:b/>
-        </w:rPr>
-      </w:pPr>
-    </w:p>
-    <w:p>
-      <w:pPr>
-        <w:pStyle w:val="Textoindependiente"/>
-        <w:rPr>
-          <w:b/>
-        </w:rPr>
-      </w:pPr>
-    </w:p>
-    <w:p>
-      <w:pPr>
-        <w:pStyle w:val="Textoindependiente"/>
-        <w:spacing w:before="20"/>
-        <w:rPr>
-          <w:b/>
-        </w:rPr>
-      </w:pPr>
-    </w:p>
-    <w:p>
-      <w:pPr>
-        <w:pStyle w:val="Textoindependiente"/>
-        <w:rPr>
-          <w:b/>
-        </w:rPr>
-        <w:sectPr>
-          <w:pgSz w:w="12240" w:h="15840"/>
-          <w:pgMar w:top="1820" w:right="1080" w:bottom="880" w:left="1440" w:header="0" w:footer="685" w:gutter="0"/>
-          <w:cols w:space="720"/>
-        </w:sectPr>
-      </w:pPr>
-    </w:p>
-    <w:p>
-      <w:pPr>
-        <w:spacing w:before="1"/>
-        <w:ind w:left="370"/>
-        <w:rPr>
-          <w:rFonts w:ascii="Tahoma" w:hAnsi="Tahoma"/>
-          <w:b/>
-        </w:rPr>
-      </w:pPr>
-      <w:r>
-        <w:rPr>
-          <w:rFonts w:ascii="Tahoma" w:hAnsi="Tahoma"/>
-          <w:b/>
-          <w:w w:val="85"/>
-        </w:rPr>
-        <w:t>{{</w:t>
-      </w:r>
-      <w:proofErr w:type="spellStart"/>
-      <w:r>
-        <w:rPr>
-          <w:rFonts w:ascii="Tahoma" w:hAnsi="Tahoma"/>
-          <w:b/>
-          <w:w w:val="85"/>
-        </w:rPr>
-        <w:t>RepresentanteLegal</w:t>
-      </w:r>
-      <w:proofErr w:type="spellEnd"/>
-      <w:r>
-        <w:rPr>
-          <w:rFonts w:ascii="Tahoma" w:hAnsi="Tahoma"/>
-          <w:b/>
-          <w:w w:val="85"/>
-        </w:rPr>
-        <w:t>}}</w:t>
-      </w:r>
-    </w:p>
-    <w:p>
-      <w:pPr>
-        <w:spacing w:before="44" w:line="280" w:lineRule="auto"/>
-        <w:ind w:left="370"/>
-        <w:rPr>
-          <w:rFonts w:ascii="Tahoma" w:hAnsi="Tahoma"/>
-          <w:b/>
-          <w:spacing w:val="-8"/>
-        </w:rPr>
-      </w:pPr>
-      <w:r>
-        <w:rPr>
-          <w:rFonts w:ascii="Tahoma" w:hAnsi="Tahoma"/>
-          <w:b/>
-        </w:rPr>
-        <w:t>C.C.</w:t>
-      </w:r>
-      <w:r>
-        <w:rPr>
-          <w:rFonts w:ascii="Tahoma" w:hAnsi="Tahoma"/>
-          <w:b/>
-          <w:spacing w:val="-9"/>
-        </w:rPr>
-        <w:t xml:space="preserve"> </w:t>
-      </w:r>
-      <w:r>
-        <w:rPr>
-          <w:rFonts w:ascii="Tahoma" w:hAnsi="Tahoma"/>
-          <w:b/>
-        </w:rPr>
-        <w:t>{{</w:t>
-      </w:r>
-      <w:proofErr w:type="spellStart"/>
-      <w:r>
-        <w:rPr>
-          <w:rFonts w:ascii="Tahoma" w:hAnsi="Tahoma"/>
-          <w:b/>
-        </w:rPr>
-        <w:t>CedulaRL</w:t>
-      </w:r>
-      <w:proofErr w:type="spellEnd"/>
-      <w:r>
-        <w:rPr>
-          <w:rFonts w:ascii="Tahoma" w:hAnsi="Tahoma"/>
-          <w:b/>
-        </w:rPr>
-        <w:t>}}</w:t>
-      </w:r>
-      <w:r>
-        <w:rPr>
-          <w:rFonts w:ascii="Tahoma" w:hAnsi="Tahoma"/>
-          <w:b/>
-        </w:rPr>
-        <w:t xml:space="preserve"> </w:t>
-      </w:r>
-      <w:r>
-        <w:rPr>
-          <w:rFonts w:ascii="Tahoma" w:hAnsi="Tahoma"/>
-          <w:b/>
-          <w:spacing w:val="-8"/>
-        </w:rPr>
-        <w:t>REPRESENTANTE</w:t>
-      </w:r>
-      <w:r>
-        <w:rPr>
-          <w:rFonts w:ascii="Tahoma" w:hAnsi="Tahoma"/>
-          <w:b/>
-          <w:spacing w:val="-9"/>
-        </w:rPr>
-        <w:t xml:space="preserve"> </w:t>
-      </w:r>
-      <w:r>
-        <w:rPr>
-          <w:rFonts w:ascii="Tahoma" w:hAnsi="Tahoma"/>
-          <w:b/>
-          <w:spacing w:val="-8"/>
-        </w:rPr>
-        <w:t xml:space="preserve">LEGAL </w:t>
-      </w:r>
-      <w:r>
-        <w:rPr>
-          <w:rFonts w:ascii="Tahoma" w:hAnsi="Tahoma"/>
-          <w:b/>
-          <w:spacing w:val="-2"/>
-          <w:w w:val="90"/>
-        </w:rPr>
-        <w:t>SILVER</w:t>
-      </w:r>
-      <w:r>
-        <w:rPr>
-          <w:rFonts w:ascii="Tahoma" w:hAnsi="Tahoma"/>
-          <w:b/>
-          <w:spacing w:val="-8"/>
-          <w:w w:val="90"/>
-        </w:rPr>
-        <w:t xml:space="preserve"> </w:t>
-      </w:r>
-      <w:r>
-        <w:rPr>
-          <w:rFonts w:ascii="Tahoma" w:hAnsi="Tahoma"/>
-          <w:b/>
-          <w:spacing w:val="-2"/>
-          <w:w w:val="90"/>
-        </w:rPr>
-        <w:t>CONSULTING</w:t>
-      </w:r>
-      <w:r>
-        <w:rPr>
-          <w:rFonts w:ascii="Tahoma" w:hAnsi="Tahoma"/>
-          <w:b/>
-          <w:spacing w:val="-5"/>
-          <w:w w:val="90"/>
-        </w:rPr>
-        <w:t xml:space="preserve"> </w:t>
-      </w:r>
-      <w:r>
-        <w:rPr>
-          <w:rFonts w:ascii="Tahoma" w:hAnsi="Tahoma"/>
-          <w:b/>
-          <w:spacing w:val="-2"/>
-          <w:w w:val="90"/>
-        </w:rPr>
-        <w:t xml:space="preserve">S.A.S. </w:t>
-      </w:r>
-      <w:r>
-        <w:rPr>
-          <w:rFonts w:ascii="Tahoma" w:hAnsi="Tahoma"/>
-          <w:b/>
-          <w:spacing w:val="-8"/>
-        </w:rPr>
-        <w:t>NIT</w:t>
-      </w:r>
-      <w:r>
-        <w:rPr>
-          <w:rFonts w:ascii="Tahoma" w:hAnsi="Tahoma"/>
-          <w:b/>
-          <w:spacing w:val="-9"/>
-        </w:rPr>
-        <w:t xml:space="preserve"> </w:t>
-      </w:r>
-      <w:r>
-        <w:rPr>
-          <w:rFonts w:ascii="Tahoma" w:hAnsi="Tahoma"/>
-          <w:b/>
-          <w:spacing w:val="-8"/>
-        </w:rPr>
-        <w:t>{{</w:t>
-      </w:r>
-      <w:proofErr w:type="spellStart"/>
-      <w:r>
-        <w:rPr>
-          <w:rFonts w:ascii="Tahoma" w:hAnsi="Tahoma"/>
-          <w:b/>
-          <w:spacing w:val="-8"/>
-        </w:rPr>
-        <w:t>NitSilver</w:t>
-      </w:r>
-      <w:proofErr w:type="spellEnd"/>
-      <w:r>
-        <w:rPr>
-          <w:rFonts w:ascii="Tahoma" w:hAnsi="Tahoma"/>
-          <w:b/>
-          <w:spacing w:val="-8"/>
-        </w:rPr>
-        <w:t>}}</w:t>
-      </w:r>
-    </w:p>
-    <w:p>
-      <w:pPr>
-        <w:ind w:left="720"/>
-        <w:rPr>
-          <w:rFonts w:ascii="Tahoma" w:hAnsi="Tahoma"/>
-          <w:b/>
-          <w:spacing w:val="-6"/>
-        </w:rPr>
-      </w:pPr>
-      <w:r>
-        <w:rPr>
-          <w:rFonts w:ascii="Tahoma"/>
-          <w:b/>
-        </w:rPr>
-        <w:t xml:space="preserve">  </w:t>
-      </w:r>
-    </w:p>
-    <w:p>
-      <w:pPr>
-        <w:ind w:left="720"/>
-        <w:rPr>
-          <w:rFonts w:ascii="Tahoma"/>
-          <w:b/>
-        </w:rPr>
-      </w:pPr>
-    </w:p>
-    <w:p>
-      <w:pPr>
-        <w:spacing w:before="1" w:line="280" w:lineRule="auto"/>
-        <w:ind w:left="720"/>
-        <w:rPr>
-          <w:rFonts w:ascii="Tahoma" w:hAnsi="Tahoma"/>
-          <w:b/>
-          <w:spacing w:val="-6"/>
-        </w:rPr>
-      </w:pPr>
-      <w:r>
-        <w:rPr>
-          <w:rFonts w:ascii="Tahoma" w:hAnsi="Tahoma"/>
-          <w:b/>
-          <w:spacing w:val="-6"/>
-        </w:rPr>
-        <w:t>{{</w:t>
-      </w:r>
-      <w:proofErr w:type="spellStart"/>
-      <w:r>
-        <w:rPr>
-          <w:rFonts w:ascii="Tahoma" w:hAnsi="Tahoma"/>
-          <w:b/>
-          <w:spacing w:val="-6"/>
-        </w:rPr>
-        <w:t>NombreCompleto</w:t>
-      </w:r>
-      <w:proofErr w:type="spellEnd"/>
-      <w:r>
-        <w:rPr>
-          <w:rFonts w:ascii="Tahoma" w:hAnsi="Tahoma"/>
-          <w:b/>
-          <w:spacing w:val="-6"/>
-        </w:rPr>
-        <w:t>}}</w:t>
-      </w:r>
-    </w:p>
-    <w:p>
-      <w:pPr>
-        <w:ind w:left="720"/>
-        <w:rPr>
-          <w:rFonts w:ascii="Tahoma"/>
-          <w:b/>
-        </w:rPr>
-      </w:pPr>
-      <w:r>
-        <w:rPr>
-          <w:rFonts w:ascii="Tahoma"/>
-          <w:b/>
-        </w:rPr>
-        <w:t>{{</w:t>
-      </w:r>
-      <w:proofErr w:type="spellStart"/>
-      <w:r>
-        <w:rPr>
-          <w:rFonts w:ascii="Tahoma"/>
-          <w:b/>
-        </w:rPr>
-        <w:t>TipoDocumento</w:t>
-      </w:r>
-      <w:proofErr w:type="spellEnd"/>
-      <w:r>
-        <w:rPr>
-          <w:rFonts w:ascii="Tahoma"/>
-          <w:b/>
-        </w:rPr>
-        <w:t>}}</w:t>
-      </w:r>
-      <w:r>
-        <w:rPr>
-          <w:rFonts w:ascii="Tahoma"/>
-          <w:b/>
-        </w:rPr>
-        <w:t xml:space="preserve"> </w:t>
-      </w:r>
-      <w:r>
-        <w:rPr>
-          <w:rFonts w:ascii="Tahoma"/>
-          <w:b/>
-          <w:spacing w:val="-2"/>
-        </w:rPr>
-        <w:t>{{</w:t>
-      </w:r>
-      <w:proofErr w:type="spellStart"/>
-      <w:r>
-        <w:rPr>
-          <w:rFonts w:ascii="Tahoma"/>
-          <w:b/>
-          <w:spacing w:val="-2"/>
-        </w:rPr>
-        <w:t>NumeroDocumento</w:t>
-      </w:r>
-      <w:proofErr w:type="spellEnd"/>
-      <w:r>
-        <w:rPr>
-          <w:rFonts w:ascii="Tahoma"/>
-          <w:b/>
-          <w:spacing w:val="-2"/>
-        </w:rPr>
-        <w:t>}}</w:t>
-      </w:r>
-      <w:r>
-        <w:rPr>
-          <w:rFonts w:ascii="Tahoma"/>
-          <w:b/>
-        </w:rPr>
-        <w:t xml:space="preserve">   </w:t>
-      </w:r>
-    </w:p>
-    <w:p>
-      <w:pPr>
-        <w:ind w:left="720"/>
-        <w:rPr>
-          <w:rFonts w:ascii="Tahoma"/>
-          <w:b/>
-        </w:rPr>
-      </w:pPr>
-    </w:p>
-    <w:p>
-      <w:pPr>
-        <w:spacing w:before="44" w:line="280" w:lineRule="auto"/>
-        <w:ind w:left="370"/>
-        <w:rPr>
-          <w:rFonts w:ascii="Tahoma" w:hAnsi="Tahoma"/>
-          <w:b/>
-          <w:spacing w:val="-8"/>
-        </w:rPr>
-      </w:pPr>
-    </w:p>
-    <w:p>
-      <w:pPr>
-        <w:spacing w:before="44" w:line="280" w:lineRule="auto"/>
-        <w:ind w:left="370"/>
-        <w:rPr>
-          <w:rFonts w:ascii="Tahoma" w:hAnsi="Tahoma"/>
-          <w:b/>
-          <w:spacing w:val="-8"/>
-        </w:rPr>
-      </w:pPr>
-    </w:p>
-    <w:p>
-      <w:pPr>
-        <w:spacing w:before="44" w:line="280" w:lineRule="auto"/>
-        <w:ind w:left="370"/>
-        <w:rPr>
-          <w:rFonts w:ascii="Tahoma" w:hAnsi="Tahoma"/>
-          <w:b/>
-          <w:spacing w:val="-8"/>
-        </w:rPr>
-      </w:pPr>
-    </w:p>
-    <w:p>
-      <w:pPr>
-        <w:spacing w:before="44" w:line="280" w:lineRule="auto"/>
-        <w:rPr>
-          <w:rFonts w:ascii="Tahoma" w:hAnsi="Tahoma"/>
-          <w:b/>
-          <w:spacing w:val="-8"/>
-        </w:rPr>
-      </w:pPr>
-    </w:p>
-    <w:p>
-      <w:pPr>
-        <w:spacing w:before="44" w:line="280" w:lineRule="auto"/>
-        <w:rPr>
-          <w:rFonts w:ascii="Tahoma" w:hAnsi="Tahoma"/>
-          <w:b/>
-          <w:spacing w:val="-8"/>
-        </w:rPr>
-        <w:sectPr>
-          <w:type w:val="continuous"/>
-          <w:pgSz w:w="12240" w:h="15840"/>
-          <w:pgMar w:top="1640" w:right="1080" w:bottom="880" w:left="1440" w:header="0" w:footer="685" w:gutter="0"/>
-          <w:cols w:num="2" w:space="1734" w:equalWidth="0">
-            <w:col w:w="3176" w:space="754"/>
-            <w:col w:w="5790"/>
-          </w:cols>
-        </w:sectPr>
-      </w:pPr>
-    </w:p>
-    <w:p>
-      <w:pPr>
-        <w:spacing w:before="1" w:line="252" w:lineRule="auto"/>
-        <w:ind w:right="4650"/>
-        <w:rPr>
-          <w:b/>
-          <w:spacing w:val="-4"/>
-          <w:sz w:val="20"/>
-        </w:rPr>
-      </w:pPr>
-    </w:p>
-    <w:p>
-      <w:pPr>
-        <w:spacing w:before="44" w:line="280" w:lineRule="auto"/>
-        <w:ind w:left="370"/>
-        <w:rPr>
-          <w:rFonts w:ascii="Tahoma" w:hAnsi="Tahoma"/>
-          <w:b/>
-          <w:spacing w:val="-8"/>
-        </w:rPr>
-      </w:pPr>
-    </w:p>
-    <w:p>
-      <w:pPr>
-        <w:spacing w:before="44" w:line="280" w:lineRule="auto"/>
-        <w:ind w:left="370"/>
-        <w:rPr>
-          <w:rFonts w:ascii="Tahoma" w:hAnsi="Tahoma"/>
-          <w:b/>
-          <w:spacing w:val="-8"/>
-        </w:rPr>
-      </w:pPr>
-    </w:p>
-    <w:p>
-      <w:pPr>
-        <w:spacing w:before="44" w:line="280" w:lineRule="auto"/>
-        <w:ind w:left="370"/>
-        <w:rPr>
-          <w:rFonts w:ascii="Tahoma" w:hAnsi="Tahoma"/>
-          <w:b/>
-          <w:spacing w:val="-8"/>
-        </w:rPr>
-      </w:pPr>
-      <w:r>
-        <w:rPr>
-          <w:rFonts w:ascii="Tahoma" w:hAnsi="Tahoma"/>
-          <w:b/>
-          <w:spacing w:val="-8"/>
-        </w:rPr>
-        <w:t xml:space="preserve">TABLA A </w:t>
-      </w:r>
-    </w:p>
-    <w:p>
-      <w:pPr>
-        <w:spacing w:before="44" w:line="280" w:lineRule="auto"/>
-        <w:ind w:left="370"/>
-        <w:rPr>
-          <w:rFonts w:ascii="Tahoma" w:hAnsi="Tahoma"/>
-          <w:b/>
-          <w:spacing w:val="-8"/>
-        </w:rPr>
-      </w:pPr>
-      <w:r>
-        <w:rPr>
-          <w:rFonts w:ascii="Tahoma" w:hAnsi="Tahoma"/>
-          <w:b/>
-          <w:spacing w:val="-8"/>
-        </w:rPr>
-        <w:t>TARIFAS</w:t>
-      </w:r>
-    </w:p>
-    <w:p>
-      <w:pPr>
-        <w:spacing w:before="44" w:line="280" w:lineRule="auto"/>
-        <w:ind w:left="370"/>
-        <w:rPr>
-          <w:rFonts w:ascii="Tahoma" w:hAnsi="Tahoma"/>
-          <w:b/>
-          <w:spacing w:val="-8"/>
-        </w:rPr>
-        <w:sectPr>
-          <w:type w:val="continuous"/>
-          <w:pgSz w:w="12240" w:h="15840"/>
-          <w:pgMar w:top="1640" w:right="1080" w:bottom="880" w:left="1440" w:header="0" w:footer="685" w:gutter="0"/>
-          <w:cols w:num="2" w:space="1734" w:equalWidth="0">
-            <w:col w:w="3176" w:space="754"/>
-            <w:col w:w="5790"/>
-          </w:cols>
-        </w:sectPr>
-      </w:pPr>
-    </w:p>
-    <w:p>
-      <w:pPr>
-        <w:spacing w:before="44" w:line="280" w:lineRule="auto"/>
-        <w:ind w:left="370"/>
-        <w:rPr>
-          <w:rFonts w:ascii="Tahoma" w:hAnsi="Tahoma"/>
-          <w:b/>
-          <w:spacing w:val="-8"/>
-        </w:rPr>
-      </w:pPr>
-      <w:r>
-        <w:rPr>
-          <w:rFonts w:ascii="Tahoma" w:hAnsi="Tahoma"/>
-          <w:b/>
-          <w:spacing w:val="-8"/>
-        </w:rPr>
-        <w:t>{#items}</w:t>
-      </w:r>
-    </w:p>
-    <w:p>
-      <w:pPr>
-        <w:spacing w:before="44" w:line="280" w:lineRule="auto"/>
-        <w:ind w:left="370"/>
-        <w:rPr>
-          <w:rFonts w:ascii="Tahoma" w:hAnsi="Tahoma"/>
-          <w:b/>
-          <w:spacing w:val="-8"/>
-        </w:rPr>
-      </w:pPr>
-      <w:r>
-        <w:rPr>
-          <w:rFonts w:ascii="Tahoma" w:hAnsi="Tahoma"/>
-          <w:b/>
-          <w:spacing w:val="-8"/>
-        </w:rPr>
-        <w:t xml:space="preserve">| {{tipo}} </w:t>
-      </w:r>
-    </w:p>
-    <w:p>
-      <w:pPr>
-        <w:spacing w:before="44" w:line="280" w:lineRule="auto"/>
-        <w:ind w:left="370"/>
-        <w:rPr>
-          <w:rFonts w:ascii="Tahoma" w:hAnsi="Tahoma"/>
-          <w:b/>
-          <w:spacing w:val="-8"/>
-        </w:rPr>
-      </w:pPr>
-      <w:r>
-        <w:rPr>
-          <w:rFonts w:ascii="Tahoma" w:hAnsi="Tahoma"/>
-          <w:b/>
-          <w:spacing w:val="-8"/>
-        </w:rPr>
-        <w:t>| {{cliente}} | {{</w:t>
-      </w:r>
-      <w:proofErr w:type="spellStart"/>
-      <w:r>
-        <w:rPr>
-          <w:rFonts w:ascii="Tahoma" w:hAnsi="Tahoma"/>
-          <w:b/>
-          <w:spacing w:val="-8"/>
-        </w:rPr>
-        <w:t>valorTarifa</w:t>
-      </w:r>
-      <w:proofErr w:type="spellEnd"/>
-      <w:r>
-        <w:rPr>
-          <w:rFonts w:ascii="Tahoma" w:hAnsi="Tahoma"/>
-          <w:b/>
-          <w:spacing w:val="-8"/>
-        </w:rPr>
-        <w:t>}} | {{</w:t>
-      </w:r>
-      <w:proofErr w:type="spellStart"/>
-      <w:r>
-        <w:rPr>
-          <w:rFonts w:ascii="Tahoma" w:hAnsi="Tahoma"/>
-          <w:b/>
-          <w:spacing w:val="-8"/>
-        </w:rPr>
-        <w:t>fechaInicio</w:t>
-      </w:r>
-      <w:proofErr w:type="spellEnd"/>
-      <w:r>
-        <w:rPr>
-          <w:rFonts w:ascii="Tahoma" w:hAnsi="Tahoma"/>
-          <w:b/>
-          <w:spacing w:val="-8"/>
-        </w:rPr>
-        <w:t>}} | {{</w:t>
-      </w:r>
-      <w:proofErr w:type="spellStart"/>
-      <w:r>
-        <w:rPr>
-          <w:rFonts w:ascii="Tahoma" w:hAnsi="Tahoma"/>
-          <w:b/>
-          <w:spacing w:val="-8"/>
-        </w:rPr>
-        <w:t>fechaFin</w:t>
-      </w:r>
-      <w:proofErr w:type="spellEnd"/>
-      <w:r>
-        <w:rPr>
-          <w:rFonts w:ascii="Tahoma" w:hAnsi="Tahoma"/>
-          <w:b/>
-          <w:spacing w:val="-8"/>
-        </w:rPr>
-        <w:t>}} |</w:t>
-      </w:r>
-    </w:p>
-    <w:p>
-      <w:pPr>
-        <w:spacing w:before="44" w:line="280" w:lineRule="auto"/>
-        <w:ind w:left="370"/>
-        <w:rPr>
-          <w:rFonts w:ascii="Tahoma" w:hAnsi="Tahoma"/>
-          <w:b/>
-        </w:rPr>
-      </w:pPr>
-      <w:r>
-        <w:rPr>
-          <w:rFonts w:ascii="Tahoma" w:hAnsi="Tahoma"/>
-          <w:b/>
-          <w:spacing w:val="-8"/>
-        </w:rPr>
-        <w:t>{/</w:t>
-      </w:r>
-      <w:proofErr w:type="spellStart"/>
-      <w:r>
-        <w:rPr>
-          <w:rFonts w:ascii="Tahoma" w:hAnsi="Tahoma"/>
-          <w:b/>
-          <w:spacing w:val="-8"/>
-        </w:rPr>
-        <w:t>items</w:t>
-      </w:r>
-      <w:proofErr w:type="spellEnd"/>
-      <w:r>
-        <w:rPr>
-          <w:rFonts w:ascii="Tahoma" w:hAnsi="Tahoma"/>
-          <w:b/>
-          <w:spacing w:val="-8"/>
-        </w:rPr>
-        <w:t>}</w:t>
-      </w:r>
-    </w:p>
-    <w:p>
-      <w:pPr>
-        <w:spacing w:before="1" w:line="280" w:lineRule="auto"/>
-        <w:ind w:left="720"/>
-      </w:pPr>
-    </w:p>
-    <w:p>
-      <w:pPr>
-        <w:spacing w:before="1" w:line="280" w:lineRule="auto"/>
-        <w:ind w:left="720"/>
-      </w:pPr>
-    </w:p>
-    <w:p>
-      <w:pPr>
         <w:spacing w:before="1" w:line="280" w:lineRule="auto"/>
         <w:ind w:left="720"/>
         <w:sectPr>
@@ -19088,48 +18330,347 @@
           <w:rFonts w:ascii="Tahoma"/>
           <w:b/>
         </w:rPr>
+        <w:sectPr>
+          <w:type w:val="continuous"/>
+          <w:pgSz w:w="12240" w:h="15840"/>
+          <w:pgMar w:top="1640" w:right="1080" w:bottom="880" w:left="1440" w:header="0" w:footer="685" w:gutter="0"/>
+          <w:cols w:space="754"/>
+        </w:sectPr>
       </w:pPr>
       <w:r>
         <w:br w:type="column"/>
-      </w:r>
-      <w:r>
-        <w:t xml:space="preserve">  </w:t>
       </w:r>
     </w:p>
     <w:p>
       <w:pPr>
-        <w:spacing w:before="101"/>
-        <w:ind w:left="854"/>
-        <w:rPr>
-          <w:b/>
+        <w:pStyle w:val="Textoindependiente"/>
+        <w:rPr>
+          <w:b/>
+          <w:sz w:val="22"/>
+        </w:rPr>
+      </w:pPr>
+    </w:p>
+    <w:tbl>
+      <w:tblPr>
+        <w:tblStyle w:val="Tablaconcuadrcula"/>
+        <w:tblW w:w="0" w:type="auto"/>
+        <w:tblInd w:w="38" w:type="dxa"/>
+        <w:tblBorders>
+          <w:top w:val="none" w:sz="0" w:space="0" w:color="auto"/>
+          <w:left w:val="none" w:sz="0" w:space="0" w:color="auto"/>
+          <w:bottom w:val="none" w:sz="0" w:space="0" w:color="auto"/>
+          <w:right w:val="none" w:sz="0" w:space="0" w:color="auto"/>
+          <w:insideH w:val="none" w:sz="0" w:space="0" w:color="auto"/>
+          <w:insideV w:val="none" w:sz="0" w:space="0" w:color="auto"/>
+        </w:tblBorders>
+        <w:tblLook w:val="04A0" w:firstRow="1" w:lastRow="0" w:firstColumn="1" w:lastColumn="0" w:noHBand="0" w:noVBand="1"/>
+      </w:tblPr>
+      <w:tblGrid>
+        <w:gridCol w:w="2311"/>
+        <w:gridCol w:w="2312"/>
+      </w:tblGrid>
+      <w:tr>
+        <w:tc>
+          <w:tcPr>
+            <w:tcW w:w="2311" w:type="dxa"/>
+          </w:tcPr>
+          <w:p>
+            <w:pPr>
+              <w:pStyle w:val="Textoindependiente"/>
+              <w:spacing w:before="32"/>
+              <w:rPr>
+                <w:b/>
+                <w:sz w:val="22"/>
+                <w:szCs w:val="22"/>
+              </w:rPr>
+            </w:pPr>
+            <w:r>
+              <w:rPr>
+                <w:b/>
+                <w:sz w:val="22"/>
+                <w:szCs w:val="22"/>
+              </w:rPr>
+              <w:t>LA EMPRESA</w:t>
+            </w:r>
+          </w:p>
+        </w:tc>
+        <w:tc>
+          <w:tcPr>
+            <w:tcW w:w="2312" w:type="dxa"/>
+          </w:tcPr>
+          <w:p>
+            <w:pPr>
+              <w:pStyle w:val="Textoindependiente"/>
+              <w:spacing w:before="32"/>
+              <w:rPr>
+                <w:b/>
+                <w:sz w:val="22"/>
+                <w:szCs w:val="22"/>
+              </w:rPr>
+            </w:pPr>
+          </w:p>
+        </w:tc>
+      </w:tr>
+      <w:tr>
+        <w:tc>
+          <w:tcPr>
+            <w:tcW w:w="4623" w:type="dxa"/>
+            <w:gridSpan w:val="2"/>
+          </w:tcPr>
+          <w:p>
+            <w:pPr>
+              <w:pStyle w:val="Textoindependiente"/>
+              <w:spacing w:before="32"/>
+              <w:rPr>
+                <w:b/>
+                <w:sz w:val="22"/>
+                <w:szCs w:val="22"/>
+              </w:rPr>
+            </w:pPr>
+          </w:p>
+        </w:tc>
+      </w:tr>
+      <w:tr>
+        <w:tc>
+          <w:tcPr>
+            <w:tcW w:w="4623" w:type="dxa"/>
+            <w:gridSpan w:val="2"/>
+          </w:tcPr>
+          <w:p>
+            <w:pPr>
+              <w:pStyle w:val="Textoindependiente"/>
+              <w:spacing w:before="32"/>
+              <w:rPr>
+                <w:b/>
+                <w:sz w:val="22"/>
+                <w:szCs w:val="22"/>
+              </w:rPr>
+            </w:pPr>
+            <w:r>
+              <w:rPr>
+                <w:b/>
+                <w:sz w:val="22"/>
+                <w:szCs w:val="22"/>
+              </w:rPr>
+              <w:t>{{</w:t>
+            </w:r>
+            <w:proofErr w:type="spellStart"/>
+            <w:r>
+              <w:rPr>
+                <w:b/>
+                <w:sz w:val="22"/>
+                <w:szCs w:val="22"/>
+              </w:rPr>
+              <w:t>RepresentanteLegal</w:t>
+            </w:r>
+            <w:proofErr w:type="spellEnd"/>
+            <w:r>
+              <w:rPr>
+                <w:b/>
+                <w:sz w:val="22"/>
+                <w:szCs w:val="22"/>
+              </w:rPr>
+              <w:t>}}</w:t>
+            </w:r>
+          </w:p>
+        </w:tc>
+      </w:tr>
+      <w:tr>
+        <w:tc>
+          <w:tcPr>
+            <w:tcW w:w="4623" w:type="dxa"/>
+            <w:gridSpan w:val="2"/>
+          </w:tcPr>
+          <w:p>
+            <w:pPr>
+              <w:pStyle w:val="Textoindependiente"/>
+              <w:spacing w:before="32"/>
+              <w:rPr>
+                <w:b/>
+                <w:sz w:val="22"/>
+                <w:szCs w:val="22"/>
+              </w:rPr>
+            </w:pPr>
+            <w:r>
+              <w:rPr>
+                <w:b/>
+                <w:sz w:val="22"/>
+                <w:szCs w:val="22"/>
+              </w:rPr>
+              <w:t>C.C.</w:t>
+            </w:r>
+            <w:r>
+              <w:rPr>
+                <w:b/>
+                <w:sz w:val="22"/>
+                <w:szCs w:val="22"/>
+              </w:rPr>
+              <w:t xml:space="preserve"> </w:t>
+            </w:r>
+            <w:r>
+              <w:rPr>
+                <w:b/>
+                <w:sz w:val="22"/>
+                <w:szCs w:val="22"/>
+              </w:rPr>
+              <w:t>{{</w:t>
+            </w:r>
+            <w:proofErr w:type="spellStart"/>
+            <w:r>
+              <w:rPr>
+                <w:b/>
+                <w:sz w:val="22"/>
+                <w:szCs w:val="22"/>
+              </w:rPr>
+              <w:t>CedulaRL</w:t>
+            </w:r>
+            <w:proofErr w:type="spellEnd"/>
+            <w:r>
+              <w:rPr>
+                <w:b/>
+                <w:sz w:val="22"/>
+                <w:szCs w:val="22"/>
+              </w:rPr>
+              <w:t>}}</w:t>
+            </w:r>
+          </w:p>
+        </w:tc>
+      </w:tr>
+      <w:tr>
+        <w:tc>
+          <w:tcPr>
+            <w:tcW w:w="4623" w:type="dxa"/>
+            <w:gridSpan w:val="2"/>
+          </w:tcPr>
+          <w:p>
+            <w:pPr>
+              <w:pStyle w:val="Textoindependiente"/>
+              <w:spacing w:before="32"/>
+              <w:rPr>
+                <w:b/>
+                <w:sz w:val="22"/>
+                <w:szCs w:val="22"/>
+              </w:rPr>
+            </w:pPr>
+            <w:r>
+              <w:rPr>
+                <w:b/>
+                <w:sz w:val="22"/>
+                <w:szCs w:val="22"/>
+              </w:rPr>
+              <w:t>R</w:t>
+            </w:r>
+            <w:r>
+              <w:rPr>
+                <w:b/>
+                <w:sz w:val="22"/>
+                <w:szCs w:val="22"/>
+              </w:rPr>
+              <w:t>epresentante Legal</w:t>
+            </w:r>
+          </w:p>
+        </w:tc>
+      </w:tr>
+      <w:tr>
+        <w:tc>
+          <w:tcPr>
+            <w:tcW w:w="4623" w:type="dxa"/>
+            <w:gridSpan w:val="2"/>
+          </w:tcPr>
+          <w:p>
+            <w:pPr>
+              <w:pStyle w:val="Textoindependiente"/>
+              <w:spacing w:before="32"/>
+              <w:rPr>
+                <w:b/>
+                <w:sz w:val="22"/>
+                <w:szCs w:val="22"/>
+              </w:rPr>
+            </w:pPr>
+            <w:r>
+              <w:rPr>
+                <w:b/>
+                <w:sz w:val="22"/>
+                <w:szCs w:val="22"/>
+              </w:rPr>
+              <w:t>NIT {{NitSilver}}</w:t>
+            </w:r>
+          </w:p>
+        </w:tc>
+      </w:tr>
+    </w:tbl>
+    <w:p>
+      <w:pPr>
+        <w:pStyle w:val="Textoindependiente"/>
+        <w:spacing w:before="32"/>
+        <w:rPr>
+          <w:b/>
+          <w:sz w:val="22"/>
+          <w:szCs w:val="22"/>
         </w:rPr>
       </w:pPr>
     </w:p>
     <w:p>
       <w:pPr>
         <w:pStyle w:val="Textoindependiente"/>
+        <w:spacing w:before="32"/>
         <w:rPr>
           <w:b/>
           <w:sz w:val="22"/>
-        </w:rPr>
-      </w:pPr>
+          <w:szCs w:val="22"/>
+        </w:rPr>
+      </w:pPr>
+      <w:r>
+        <w:rPr>
+          <w:b/>
+          <w:sz w:val="22"/>
+          <w:szCs w:val="22"/>
+        </w:rPr>
+        <w:tab/>
+      </w:r>
     </w:p>
     <w:p>
       <w:pPr>
         <w:pStyle w:val="Textoindependiente"/>
+        <w:spacing w:before="32"/>
         <w:rPr>
           <w:b/>
           <w:sz w:val="22"/>
-        </w:rPr>
-      </w:pPr>
+          <w:szCs w:val="22"/>
+        </w:rPr>
+      </w:pPr>
+      <w:r>
+        <w:rPr>
+          <w:b/>
+          <w:sz w:val="22"/>
+          <w:szCs w:val="22"/>
+        </w:rPr>
+        <w:tab/>
+      </w:r>
+      <w:r>
+        <w:rPr>
+          <w:b/>
+          <w:sz w:val="22"/>
+          <w:szCs w:val="22"/>
+        </w:rPr>
+        <w:tab/>
+      </w:r>
+      <w:r>
+        <w:rPr>
+          <w:b/>
+          <w:sz w:val="22"/>
+          <w:szCs w:val="22"/>
+        </w:rPr>
+        <w:tab/>
+      </w:r>
     </w:p>
     <w:p>
       <w:pPr>
-        <w:pStyle w:val="Textoindependiente"/>
-        <w:spacing w:before="32"/>
-        <w:rPr>
-          <w:b/>
-          <w:sz w:val="22"/>
+        <w:spacing w:before="1" w:line="252" w:lineRule="auto"/>
+        <w:ind w:right="4650"/>
+        <w:rPr>
+          <w:b/>
+          <w:spacing w:val="-4"/>
         </w:rPr>
       </w:pPr>
     </w:p>
@@ -19140,47 +18681,352 @@
         <w:rPr>
           <w:b/>
           <w:spacing w:val="-4"/>
-          <w:sz w:val="20"/>
         </w:rPr>
       </w:pPr>
     </w:p>
     <w:p>
       <w:pPr>
         <w:spacing w:before="1" w:line="252" w:lineRule="auto"/>
-        <w:ind w:left="284" w:right="4650" w:hanging="284"/>
-        <w:rPr>
-          <w:b/>
-          <w:spacing w:val="-4"/>
-          <w:sz w:val="20"/>
+        <w:ind w:right="4650"/>
+        <w:rPr>
+          <w:b/>
+          <w:spacing w:val="-4"/>
         </w:rPr>
       </w:pPr>
     </w:p>
     <w:p>
       <w:pPr>
         <w:spacing w:before="1" w:line="252" w:lineRule="auto"/>
-        <w:ind w:left="370" w:right="4650" w:firstLine="12"/>
-        <w:rPr>
-          <w:b/>
-          <w:spacing w:val="-4"/>
-          <w:sz w:val="20"/>
+        <w:ind w:right="4650"/>
+        <w:rPr>
+          <w:b/>
+          <w:spacing w:val="-4"/>
         </w:rPr>
       </w:pPr>
     </w:p>
     <w:p>
       <w:pPr>
         <w:spacing w:before="1" w:line="252" w:lineRule="auto"/>
-        <w:ind w:left="370" w:right="4650" w:firstLine="12"/>
-        <w:rPr>
-          <w:b/>
-          <w:spacing w:val="-4"/>
-          <w:sz w:val="20"/>
+        <w:ind w:right="4650"/>
+        <w:rPr>
+          <w:b/>
+          <w:spacing w:val="-4"/>
+        </w:rPr>
+      </w:pPr>
+    </w:p>
+    <w:tbl>
+      <w:tblPr>
+        <w:tblStyle w:val="Tablaconcuadrcula"/>
+        <w:tblW w:w="0" w:type="auto"/>
+        <w:tblInd w:w="38" w:type="dxa"/>
+        <w:tblBorders>
+          <w:top w:val="none" w:sz="0" w:space="0" w:color="auto"/>
+          <w:left w:val="none" w:sz="0" w:space="0" w:color="auto"/>
+          <w:bottom w:val="none" w:sz="0" w:space="0" w:color="auto"/>
+          <w:right w:val="none" w:sz="0" w:space="0" w:color="auto"/>
+          <w:insideH w:val="none" w:sz="0" w:space="0" w:color="auto"/>
+          <w:insideV w:val="none" w:sz="0" w:space="0" w:color="auto"/>
+        </w:tblBorders>
+        <w:tblLook w:val="04A0" w:firstRow="1" w:lastRow="0" w:firstColumn="1" w:lastColumn="0" w:noHBand="0" w:noVBand="1"/>
+      </w:tblPr>
+      <w:tblGrid>
+        <w:gridCol w:w="2592"/>
+        <w:gridCol w:w="2069"/>
+      </w:tblGrid>
+      <w:tr>
+        <w:tc>
+          <w:tcPr>
+            <w:tcW w:w="2592" w:type="dxa"/>
+          </w:tcPr>
+          <w:p>
+            <w:pPr>
+              <w:pStyle w:val="Textoindependiente"/>
+              <w:spacing w:before="32"/>
+              <w:rPr>
+                <w:b/>
+                <w:sz w:val="22"/>
+                <w:szCs w:val="22"/>
+              </w:rPr>
+            </w:pPr>
+            <w:r>
+              <w:rPr>
+                <w:b/>
+                <w:sz w:val="22"/>
+                <w:szCs w:val="22"/>
+              </w:rPr>
+              <w:t>E</w:t>
+            </w:r>
+            <w:r>
+              <w:rPr>
+                <w:b/>
+                <w:sz w:val="22"/>
+                <w:szCs w:val="22"/>
+              </w:rPr>
+              <w:t>L CONTRATISTA</w:t>
+            </w:r>
+          </w:p>
+        </w:tc>
+        <w:tc>
+          <w:tcPr>
+            <w:tcW w:w="2069" w:type="dxa"/>
+          </w:tcPr>
+          <w:p>
+            <w:pPr>
+              <w:pStyle w:val="Textoindependiente"/>
+              <w:spacing w:before="32"/>
+              <w:rPr>
+                <w:b/>
+                <w:sz w:val="22"/>
+                <w:szCs w:val="22"/>
+              </w:rPr>
+            </w:pPr>
+          </w:p>
+        </w:tc>
+      </w:tr>
+      <w:tr>
+        <w:tc>
+          <w:tcPr>
+            <w:tcW w:w="2592" w:type="dxa"/>
+          </w:tcPr>
+          <w:p>
+            <w:pPr>
+              <w:pStyle w:val="Textoindependiente"/>
+              <w:spacing w:before="32"/>
+              <w:rPr>
+                <w:b/>
+                <w:sz w:val="22"/>
+                <w:szCs w:val="22"/>
+              </w:rPr>
+            </w:pPr>
+          </w:p>
+        </w:tc>
+        <w:tc>
+          <w:tcPr>
+            <w:tcW w:w="2069" w:type="dxa"/>
+          </w:tcPr>
+          <w:p>
+            <w:pPr>
+              <w:pStyle w:val="Textoindependiente"/>
+              <w:spacing w:before="32"/>
+              <w:rPr>
+                <w:b/>
+                <w:sz w:val="22"/>
+                <w:szCs w:val="22"/>
+              </w:rPr>
+            </w:pPr>
+          </w:p>
+        </w:tc>
+      </w:tr>
+      <w:tr>
+        <w:tc>
+          <w:tcPr>
+            <w:tcW w:w="2592" w:type="dxa"/>
+          </w:tcPr>
+          <w:p>
+            <w:pPr>
+              <w:spacing w:before="1" w:line="280" w:lineRule="auto"/>
+              <w:rPr>
+                <w:b/>
+                <w:spacing w:val="-6"/>
+              </w:rPr>
+            </w:pPr>
+            <w:r>
+              <w:rPr>
+                <w:b/>
+                <w:spacing w:val="-6"/>
+              </w:rPr>
+              <w:t>{{</w:t>
+            </w:r>
+            <w:proofErr w:type="spellStart"/>
+            <w:r>
+              <w:rPr>
+                <w:b/>
+                <w:spacing w:val="-6"/>
+              </w:rPr>
+              <w:t>NombreCompleto</w:t>
+            </w:r>
+            <w:proofErr w:type="spellEnd"/>
+            <w:r>
+              <w:rPr>
+                <w:b/>
+                <w:spacing w:val="-6"/>
+              </w:rPr>
+              <w:t>}}</w:t>
+            </w:r>
+          </w:p>
+        </w:tc>
+        <w:tc>
+          <w:tcPr>
+            <w:tcW w:w="2069" w:type="dxa"/>
+          </w:tcPr>
+          <w:p>
+            <w:pPr>
+              <w:pStyle w:val="Textoindependiente"/>
+              <w:spacing w:before="32"/>
+              <w:rPr>
+                <w:b/>
+                <w:sz w:val="22"/>
+                <w:szCs w:val="22"/>
+              </w:rPr>
+            </w:pPr>
+          </w:p>
+        </w:tc>
+      </w:tr>
+      <w:tr>
+        <w:tc>
+          <w:tcPr>
+            <w:tcW w:w="4661" w:type="dxa"/>
+            <w:gridSpan w:val="2"/>
+          </w:tcPr>
+          <w:p>
+            <w:pPr>
+              <w:rPr>
+                <w:b/>
+              </w:rPr>
+            </w:pPr>
+            <w:r>
+              <w:rPr>
+                <w:b/>
+              </w:rPr>
+              <w:t>{{</w:t>
+            </w:r>
+            <w:proofErr w:type="spellStart"/>
+            <w:r>
+              <w:rPr>
+                <w:b/>
+              </w:rPr>
+              <w:t>TipoDocumento</w:t>
+            </w:r>
+            <w:proofErr w:type="spellEnd"/>
+            <w:r>
+              <w:rPr>
+                <w:b/>
+              </w:rPr>
+              <w:t>}}</w:t>
+            </w:r>
+            <w:r>
+              <w:rPr>
+                <w:b/>
+              </w:rPr>
+              <w:t xml:space="preserve"> </w:t>
+            </w:r>
+            <w:r>
+              <w:rPr>
+                <w:b/>
+                <w:spacing w:val="-2"/>
+              </w:rPr>
+              <w:t>{{</w:t>
+            </w:r>
+            <w:proofErr w:type="spellStart"/>
+            <w:r>
+              <w:rPr>
+                <w:b/>
+                <w:spacing w:val="-2"/>
+              </w:rPr>
+              <w:t>NumeroDocumento</w:t>
+            </w:r>
+            <w:proofErr w:type="spellEnd"/>
+            <w:proofErr w:type="gramStart"/>
+            <w:r>
+              <w:rPr>
+                <w:b/>
+                <w:spacing w:val="-2"/>
+              </w:rPr>
+              <w:t>}}</w:t>
+            </w:r>
+            <w:r>
+              <w:rPr>
+                <w:b/>
+              </w:rPr>
+              <w:t xml:space="preserve">   </w:t>
+            </w:r>
+            <w:proofErr w:type="gramEnd"/>
+          </w:p>
+        </w:tc>
+      </w:tr>
+      <w:tr>
+        <w:tc>
+          <w:tcPr>
+            <w:tcW w:w="2592" w:type="dxa"/>
+          </w:tcPr>
+          <w:p>
+            <w:pPr>
+              <w:pStyle w:val="Textoindependiente"/>
+              <w:spacing w:before="32"/>
+              <w:rPr>
+                <w:b/>
+                <w:sz w:val="22"/>
+                <w:szCs w:val="22"/>
+              </w:rPr>
+            </w:pPr>
+          </w:p>
+        </w:tc>
+        <w:tc>
+          <w:tcPr>
+            <w:tcW w:w="2069" w:type="dxa"/>
+          </w:tcPr>
+          <w:p>
+            <w:pPr>
+              <w:pStyle w:val="Textoindependiente"/>
+              <w:spacing w:before="32"/>
+              <w:rPr>
+                <w:b/>
+                <w:sz w:val="22"/>
+                <w:szCs w:val="22"/>
+              </w:rPr>
+            </w:pPr>
+          </w:p>
+        </w:tc>
+      </w:tr>
+      <w:tr>
+        <w:tc>
+          <w:tcPr>
+            <w:tcW w:w="2592" w:type="dxa"/>
+          </w:tcPr>
+          <w:p>
+            <w:pPr>
+              <w:pStyle w:val="Textoindependiente"/>
+              <w:spacing w:before="32"/>
+              <w:rPr>
+                <w:b/>
+                <w:sz w:val="22"/>
+                <w:szCs w:val="22"/>
+              </w:rPr>
+            </w:pPr>
+          </w:p>
+        </w:tc>
+        <w:tc>
+          <w:tcPr>
+            <w:tcW w:w="2069" w:type="dxa"/>
+          </w:tcPr>
+          <w:p>
+            <w:pPr>
+              <w:pStyle w:val="Textoindependiente"/>
+              <w:spacing w:before="32"/>
+              <w:rPr>
+                <w:b/>
+                <w:sz w:val="22"/>
+                <w:szCs w:val="22"/>
+              </w:rPr>
+            </w:pPr>
+          </w:p>
+        </w:tc>
+      </w:tr>
+    </w:tbl>
+    <w:p>
+      <w:pPr>
+        <w:spacing w:before="1" w:line="252" w:lineRule="auto"/>
+        <w:ind w:right="4650"/>
+        <w:rPr>
+          <w:b/>
+          <w:spacing w:val="-4"/>
         </w:rPr>
       </w:pPr>
     </w:p>
     <w:p>
       <w:pPr>
         <w:spacing w:before="1" w:line="252" w:lineRule="auto"/>
-        <w:ind w:left="370" w:right="4650" w:firstLine="12"/>
+        <w:ind w:right="4650"/>
         <w:rPr>
           <w:b/>
           <w:spacing w:val="-4"/>
@@ -19202,7 +19048,7 @@
     <w:p>
       <w:pPr>
         <w:spacing w:before="1" w:line="252" w:lineRule="auto"/>
-        <w:ind w:left="370" w:right="4650" w:firstLine="12"/>
+        <w:ind w:right="4650"/>
         <w:rPr>
           <w:b/>
           <w:spacing w:val="-4"/>
@@ -19213,7 +19059,7 @@
     <w:p>
       <w:pPr>
         <w:spacing w:before="1" w:line="252" w:lineRule="auto"/>
-        <w:ind w:left="370" w:right="4650" w:firstLine="12"/>
+        <w:ind w:right="4650"/>
         <w:rPr>
           <w:b/>
           <w:spacing w:val="-4"/>
@@ -19224,7 +19070,7 @@
     <w:p>
       <w:pPr>
         <w:spacing w:before="1" w:line="252" w:lineRule="auto"/>
-        <w:ind w:left="370" w:right="4650" w:firstLine="12"/>
+        <w:ind w:right="4650"/>
         <w:rPr>
           <w:b/>
           <w:spacing w:val="-4"/>
@@ -19235,7 +19081,7 @@
     <w:p>
       <w:pPr>
         <w:spacing w:before="1" w:line="252" w:lineRule="auto"/>
-        <w:ind w:left="370" w:right="4650" w:firstLine="12"/>
+        <w:ind w:right="4650"/>
         <w:rPr>
           <w:b/>
           <w:spacing w:val="-4"/>
@@ -19246,7 +19092,7 @@
     <w:p>
       <w:pPr>
         <w:spacing w:before="1" w:line="252" w:lineRule="auto"/>
-        <w:ind w:left="370" w:right="4650" w:firstLine="12"/>
+        <w:ind w:right="4650"/>
         <w:rPr>
           <w:b/>
           <w:spacing w:val="-4"/>
@@ -19257,18 +19103,24 @@
     <w:p>
       <w:pPr>
         <w:spacing w:before="1" w:line="252" w:lineRule="auto"/>
-        <w:ind w:left="370" w:right="4650" w:firstLine="12"/>
-        <w:rPr>
-          <w:b/>
-          <w:spacing w:val="-4"/>
-          <w:sz w:val="20"/>
-        </w:rPr>
+        <w:ind w:right="4650"/>
+        <w:rPr>
+          <w:b/>
+          <w:spacing w:val="-4"/>
+          <w:sz w:val="20"/>
+        </w:rPr>
+        <w:sectPr>
+          <w:type w:val="continuous"/>
+          <w:pgSz w:w="12240" w:h="15840"/>
+          <w:pgMar w:top="1640" w:right="1080" w:bottom="880" w:left="1440" w:header="0" w:footer="685" w:gutter="0"/>
+          <w:cols w:num="2" w:space="754"/>
+        </w:sectPr>
       </w:pPr>
     </w:p>
     <w:p>
       <w:pPr>
         <w:spacing w:before="1" w:line="252" w:lineRule="auto"/>
-        <w:ind w:left="370" w:right="4650" w:firstLine="12"/>
+        <w:ind w:right="4650"/>
         <w:rPr>
           <w:b/>
           <w:spacing w:val="-4"/>
@@ -19279,7 +19131,7 @@
     <w:p>
       <w:pPr>
         <w:spacing w:before="1" w:line="252" w:lineRule="auto"/>
-        <w:ind w:left="370" w:right="4650" w:firstLine="12"/>
+        <w:ind w:right="4650"/>
         <w:rPr>
           <w:b/>
           <w:spacing w:val="-4"/>
@@ -19301,7 +19153,7 @@
     <w:p>
       <w:pPr>
         <w:spacing w:before="1" w:line="252" w:lineRule="auto"/>
-        <w:ind w:left="370" w:right="4650" w:firstLine="12"/>
+        <w:ind w:right="4650"/>
         <w:rPr>
           <w:b/>
           <w:spacing w:val="-4"/>
@@ -19312,7 +19164,7 @@
     <w:p>
       <w:pPr>
         <w:spacing w:before="1" w:line="252" w:lineRule="auto"/>
-        <w:ind w:left="370" w:right="4650" w:firstLine="12"/>
+        <w:ind w:right="4650"/>
         <w:rPr>
           <w:b/>
           <w:spacing w:val="-4"/>
@@ -19323,7 +19175,7 @@
     <w:p>
       <w:pPr>
         <w:spacing w:before="1" w:line="252" w:lineRule="auto"/>
-        <w:ind w:left="370" w:right="4650" w:firstLine="12"/>
+        <w:ind w:right="4650"/>
         <w:rPr>
           <w:b/>
           <w:spacing w:val="-4"/>
@@ -19334,7 +19186,7 @@
     <w:p>
       <w:pPr>
         <w:spacing w:before="1" w:line="252" w:lineRule="auto"/>
-        <w:ind w:left="370" w:right="4650" w:firstLine="12"/>
+        <w:ind w:right="4650"/>
         <w:rPr>
           <w:b/>
           <w:spacing w:val="-4"/>
@@ -19345,7 +19197,7 @@
     <w:p>
       <w:pPr>
         <w:spacing w:before="1" w:line="252" w:lineRule="auto"/>
-        <w:ind w:left="370" w:right="4650" w:firstLine="12"/>
+        <w:ind w:right="4650"/>
         <w:rPr>
           <w:b/>
           <w:spacing w:val="-4"/>
@@ -19356,7 +19208,7 @@
     <w:p>
       <w:pPr>
         <w:spacing w:before="1" w:line="252" w:lineRule="auto"/>
-        <w:ind w:left="370" w:right="4650" w:firstLine="12"/>
+        <w:ind w:right="4650"/>
         <w:rPr>
           <w:b/>
           <w:spacing w:val="-4"/>
@@ -19367,7 +19219,7 @@
     <w:p>
       <w:pPr>
         <w:spacing w:before="1" w:line="252" w:lineRule="auto"/>
-        <w:ind w:left="370" w:right="4650" w:firstLine="12"/>
+        <w:ind w:right="4650"/>
         <w:rPr>
           <w:b/>
           <w:spacing w:val="-4"/>
@@ -19378,7 +19230,7 @@
     <w:p>
       <w:pPr>
         <w:spacing w:before="1" w:line="252" w:lineRule="auto"/>
-        <w:ind w:left="370" w:right="4650" w:firstLine="12"/>
+        <w:ind w:right="4650"/>
         <w:rPr>
           <w:b/>
           <w:spacing w:val="-4"/>
@@ -19389,7 +19241,7 @@
     <w:p>
       <w:pPr>
         <w:spacing w:before="1" w:line="252" w:lineRule="auto"/>
-        <w:ind w:left="370" w:right="4650" w:firstLine="12"/>
+        <w:ind w:right="4650"/>
         <w:rPr>
           <w:b/>
           <w:spacing w:val="-4"/>
@@ -19400,7 +19252,7 @@
     <w:p>
       <w:pPr>
         <w:spacing w:before="1" w:line="252" w:lineRule="auto"/>
-        <w:ind w:left="370" w:right="4650" w:firstLine="12"/>
+        <w:ind w:right="4650"/>
         <w:rPr>
           <w:b/>
           <w:spacing w:val="-4"/>
@@ -19411,7 +19263,7 @@
     <w:p>
       <w:pPr>
         <w:spacing w:before="1" w:line="252" w:lineRule="auto"/>
-        <w:ind w:left="370" w:right="4650" w:firstLine="12"/>
+        <w:ind w:right="4650"/>
         <w:rPr>
           <w:b/>
           <w:spacing w:val="-4"/>
@@ -19422,7 +19274,7 @@
     <w:p>
       <w:pPr>
         <w:spacing w:before="1" w:line="252" w:lineRule="auto"/>
-        <w:ind w:left="370" w:right="4650" w:firstLine="12"/>
+        <w:ind w:right="4650"/>
         <w:rPr>
           <w:b/>
           <w:spacing w:val="-4"/>
@@ -19433,7 +19285,7 @@
     <w:p>
       <w:pPr>
         <w:spacing w:before="1" w:line="252" w:lineRule="auto"/>
-        <w:ind w:left="370" w:right="4650" w:firstLine="12"/>
+        <w:ind w:right="4650"/>
         <w:rPr>
           <w:b/>
           <w:spacing w:val="-4"/>
@@ -19444,7 +19296,7 @@
     <w:p>
       <w:pPr>
         <w:spacing w:before="1" w:line="252" w:lineRule="auto"/>
-        <w:ind w:left="370" w:right="4650" w:firstLine="12"/>
+        <w:ind w:right="4650"/>
         <w:rPr>
           <w:b/>
           <w:spacing w:val="-4"/>
@@ -19455,7 +19307,7 @@
     <w:p>
       <w:pPr>
         <w:spacing w:before="1" w:line="252" w:lineRule="auto"/>
-        <w:ind w:left="370" w:right="4650" w:firstLine="12"/>
+        <w:ind w:right="4650"/>
         <w:rPr>
           <w:b/>
           <w:spacing w:val="-4"/>
@@ -19466,7 +19318,7 @@
     <w:p>
       <w:pPr>
         <w:spacing w:before="1" w:line="252" w:lineRule="auto"/>
-        <w:ind w:left="370" w:right="4650" w:firstLine="12"/>
+        <w:ind w:right="4650"/>
         <w:rPr>
           <w:b/>
           <w:spacing w:val="-4"/>
@@ -19477,7 +19329,7 @@
     <w:p>
       <w:pPr>
         <w:spacing w:before="1" w:line="252" w:lineRule="auto"/>
-        <w:ind w:left="370" w:right="4650" w:firstLine="12"/>
+        <w:ind w:right="4650"/>
         <w:rPr>
           <w:b/>
           <w:spacing w:val="-4"/>
@@ -19488,7 +19340,7 @@
     <w:p>
       <w:pPr>
         <w:spacing w:before="1" w:line="252" w:lineRule="auto"/>
-        <w:ind w:left="370" w:right="4650" w:firstLine="12"/>
+        <w:ind w:right="4650"/>
         <w:rPr>
           <w:b/>
           <w:spacing w:val="-4"/>
@@ -19506,15 +19358,462 @@
           <w:sz w:val="20"/>
         </w:rPr>
       </w:pPr>
+    </w:p>
+    <w:p>
+      <w:pPr>
+        <w:spacing w:before="1" w:line="252" w:lineRule="auto"/>
+        <w:ind w:right="4650"/>
+        <w:rPr>
+          <w:b/>
+          <w:spacing w:val="-4"/>
+          <w:sz w:val="20"/>
+        </w:rPr>
+      </w:pPr>
+    </w:p>
+    <w:p>
+      <w:pPr>
+        <w:spacing w:before="1" w:line="252" w:lineRule="auto"/>
+        <w:ind w:right="4650"/>
+        <w:rPr>
+          <w:b/>
+          <w:spacing w:val="-4"/>
+          <w:sz w:val="20"/>
+        </w:rPr>
+      </w:pPr>
+    </w:p>
+    <w:p>
+      <w:pPr>
+        <w:spacing w:before="1" w:line="252" w:lineRule="auto"/>
+        <w:ind w:right="4650"/>
+        <w:rPr>
+          <w:b/>
+          <w:spacing w:val="-4"/>
+          <w:sz w:val="20"/>
+        </w:rPr>
+      </w:pPr>
+    </w:p>
+    <w:p>
+      <w:pPr>
+        <w:spacing w:before="1" w:line="252" w:lineRule="auto"/>
+        <w:ind w:right="4650"/>
+        <w:rPr>
+          <w:b/>
+          <w:spacing w:val="-4"/>
+          <w:sz w:val="20"/>
+        </w:rPr>
+      </w:pPr>
+    </w:p>
+    <w:p>
+      <w:pPr>
+        <w:spacing w:before="1" w:line="252" w:lineRule="auto"/>
+        <w:ind w:right="4650"/>
+        <w:rPr>
+          <w:b/>
+          <w:spacing w:val="-4"/>
+          <w:sz w:val="20"/>
+        </w:rPr>
+      </w:pPr>
+    </w:p>
+    <w:p>
+      <w:pPr>
+        <w:spacing w:before="1" w:line="252" w:lineRule="auto"/>
+        <w:ind w:right="4650"/>
+        <w:rPr>
+          <w:b/>
+          <w:spacing w:val="-4"/>
+          <w:sz w:val="20"/>
+        </w:rPr>
+      </w:pPr>
+    </w:p>
+    <w:p>
+      <w:pPr>
+        <w:spacing w:before="1" w:line="252" w:lineRule="auto"/>
+        <w:ind w:right="4650"/>
+        <w:rPr>
+          <w:b/>
+          <w:spacing w:val="-4"/>
+          <w:sz w:val="20"/>
+        </w:rPr>
+      </w:pPr>
+    </w:p>
+    <w:p>
+      <w:pPr>
+        <w:spacing w:before="1" w:line="252" w:lineRule="auto"/>
+        <w:ind w:right="4650"/>
+        <w:rPr>
+          <w:b/>
+          <w:spacing w:val="-4"/>
+          <w:sz w:val="20"/>
+        </w:rPr>
+      </w:pPr>
+    </w:p>
+    <w:p>
+      <w:pPr>
+        <w:spacing w:before="1" w:line="252" w:lineRule="auto"/>
+        <w:ind w:right="4650"/>
+        <w:rPr>
+          <w:b/>
+          <w:spacing w:val="-4"/>
+          <w:sz w:val="20"/>
+        </w:rPr>
+      </w:pPr>
+    </w:p>
+    <w:p>
+      <w:pPr>
+        <w:spacing w:before="1" w:line="252" w:lineRule="auto"/>
+        <w:ind w:right="4650"/>
+        <w:rPr>
+          <w:b/>
+          <w:spacing w:val="-4"/>
+          <w:sz w:val="20"/>
+        </w:rPr>
+      </w:pPr>
+    </w:p>
+    <w:p>
+      <w:pPr>
+        <w:spacing w:before="1" w:line="252" w:lineRule="auto"/>
+        <w:ind w:right="4650"/>
+        <w:rPr>
+          <w:b/>
+          <w:spacing w:val="-4"/>
+          <w:sz w:val="20"/>
+        </w:rPr>
+      </w:pPr>
+    </w:p>
+    <w:p>
+      <w:pPr>
+        <w:spacing w:before="1" w:line="252" w:lineRule="auto"/>
+        <w:ind w:right="4650"/>
+        <w:rPr>
+          <w:b/>
+          <w:spacing w:val="-4"/>
+          <w:sz w:val="20"/>
+        </w:rPr>
+      </w:pPr>
+    </w:p>
+    <w:p>
+      <w:pPr>
+        <w:spacing w:before="1" w:line="252" w:lineRule="auto"/>
+        <w:ind w:right="4650"/>
+        <w:rPr>
+          <w:b/>
+          <w:spacing w:val="-4"/>
+          <w:sz w:val="20"/>
+        </w:rPr>
+      </w:pPr>
+    </w:p>
+    <w:p>
+      <w:pPr>
+        <w:spacing w:before="1" w:line="252" w:lineRule="auto"/>
+        <w:ind w:right="4650"/>
+        <w:rPr>
+          <w:b/>
+          <w:spacing w:val="-4"/>
+          <w:sz w:val="20"/>
+        </w:rPr>
+      </w:pPr>
+    </w:p>
+    <w:p>
+      <w:pPr>
+        <w:spacing w:before="1" w:line="252" w:lineRule="auto"/>
+        <w:ind w:right="81"/>
+        <w:rPr>
+          <w:b/>
+          <w:spacing w:val="-4"/>
+          <w:sz w:val="20"/>
+        </w:rPr>
+      </w:pPr>
+    </w:p>
+    <w:p>
+      <w:pPr>
+        <w:spacing w:before="1" w:line="252" w:lineRule="auto"/>
+        <w:ind w:right="81"/>
+        <w:jc w:val="center"/>
+        <w:rPr>
+          <w:b/>
+          <w:spacing w:val="-4"/>
+          <w:sz w:val="20"/>
+        </w:rPr>
+      </w:pPr>
+      <w:r>
+        <w:rPr>
+          <w:b/>
+          <w:spacing w:val="-4"/>
+          <w:sz w:val="20"/>
+        </w:rPr>
+        <w:t>TABLA A</w:t>
+      </w:r>
+    </w:p>
+    <w:p>
+      <w:pPr>
+        <w:spacing w:before="1" w:line="252" w:lineRule="auto"/>
+        <w:ind w:right="81"/>
+        <w:jc w:val="center"/>
+        <w:rPr>
+          <w:b/>
+          <w:spacing w:val="-4"/>
+          <w:sz w:val="20"/>
+        </w:rPr>
+      </w:pPr>
+      <w:r>
+        <w:rPr>
+          <w:b/>
+          <w:spacing w:val="-4"/>
+          <w:sz w:val="20"/>
+        </w:rPr>
+        <w:t>TARIFAS</w:t>
+      </w:r>
+    </w:p>
+    <w:p>
+      <w:pPr>
+        <w:spacing w:before="1" w:line="252" w:lineRule="auto"/>
+        <w:ind w:right="81"/>
+        <w:rPr>
+          <w:b/>
+          <w:spacing w:val="-4"/>
+          <w:sz w:val="20"/>
+        </w:rPr>
+      </w:pPr>
+      <w:r>
+        <w:rPr>
+          <w:b/>
+          <w:spacing w:val="-4"/>
+          <w:sz w:val="20"/>
+        </w:rPr>
+        <w:t xml:space="preserve"> </w:t>
+      </w:r>
+    </w:p>
+    <w:p>
+      <w:pPr>
+        <w:spacing w:before="1" w:line="252" w:lineRule="auto"/>
+        <w:ind w:right="81"/>
+        <w:rPr>
+          <w:b/>
+          <w:spacing w:val="-4"/>
+          <w:sz w:val="20"/>
+        </w:rPr>
+      </w:pPr>
+      <w:r>
+        <w:rPr>
+          <w:b/>
+          <w:spacing w:val="-4"/>
+          <w:sz w:val="20"/>
+        </w:rPr>
+        <w:t>{#items}</w:t>
+      </w:r>
+    </w:p>
+    <w:p>
+      <w:pPr>
+        <w:spacing w:before="1" w:line="252" w:lineRule="auto"/>
+        <w:ind w:right="81"/>
+        <w:rPr>
+          <w:b/>
+          <w:spacing w:val="-4"/>
+          <w:sz w:val="20"/>
+        </w:rPr>
+      </w:pPr>
+      <w:r>
+        <w:rPr>
+          <w:b/>
+          <w:spacing w:val="-4"/>
+          <w:sz w:val="20"/>
+        </w:rPr>
+        <w:t xml:space="preserve">| {{tipo}} </w:t>
+      </w:r>
+    </w:p>
+    <w:p>
+      <w:pPr>
+        <w:tabs>
+          <w:tab w:val="left" w:pos="4962"/>
+        </w:tabs>
+        <w:spacing w:before="1" w:line="252" w:lineRule="auto"/>
+        <w:ind w:right="81"/>
+        <w:rPr>
+          <w:b/>
+          <w:spacing w:val="-4"/>
+          <w:sz w:val="20"/>
+        </w:rPr>
+      </w:pPr>
+      <w:r>
+        <w:rPr>
+          <w:b/>
+          <w:spacing w:val="-4"/>
+          <w:sz w:val="20"/>
+        </w:rPr>
+        <w:t>| {{cliente}} | {{</w:t>
+      </w:r>
+      <w:proofErr w:type="spellStart"/>
+      <w:r>
+        <w:rPr>
+          <w:b/>
+          <w:spacing w:val="-4"/>
+          <w:sz w:val="20"/>
+        </w:rPr>
+        <w:t>valorTarifa</w:t>
+      </w:r>
+      <w:proofErr w:type="spellEnd"/>
+      <w:r>
+        <w:rPr>
+          <w:b/>
+          <w:spacing w:val="-4"/>
+          <w:sz w:val="20"/>
+        </w:rPr>
+        <w:t>}} | {{</w:t>
+      </w:r>
+      <w:proofErr w:type="spellStart"/>
+      <w:r>
+        <w:rPr>
+          <w:b/>
+          <w:spacing w:val="-4"/>
+          <w:sz w:val="20"/>
+        </w:rPr>
+        <w:t>fechaInicio</w:t>
+      </w:r>
+      <w:proofErr w:type="spellEnd"/>
+      <w:r>
+        <w:rPr>
+          <w:b/>
+          <w:spacing w:val="-4"/>
+          <w:sz w:val="20"/>
+        </w:rPr>
+        <w:t>}} | {{</w:t>
+      </w:r>
+      <w:proofErr w:type="spellStart"/>
+      <w:r>
+        <w:rPr>
+          <w:b/>
+          <w:spacing w:val="-4"/>
+          <w:sz w:val="20"/>
+        </w:rPr>
+        <w:t>fechaFin</w:t>
+      </w:r>
+      <w:proofErr w:type="spellEnd"/>
+      <w:r>
+        <w:rPr>
+          <w:b/>
+          <w:spacing w:val="-4"/>
+          <w:sz w:val="20"/>
+        </w:rPr>
+        <w:t>}} |</w:t>
+      </w:r>
+    </w:p>
+    <w:p>
+      <w:pPr>
+        <w:spacing w:before="1" w:line="252" w:lineRule="auto"/>
+        <w:ind w:right="81"/>
+        <w:rPr>
+          <w:b/>
+          <w:spacing w:val="-4"/>
+          <w:sz w:val="20"/>
+        </w:rPr>
+      </w:pPr>
+      <w:r>
+        <w:rPr>
+          <w:b/>
+          <w:spacing w:val="-4"/>
+          <w:sz w:val="20"/>
+        </w:rPr>
+        <w:t>{/</w:t>
+      </w:r>
+      <w:proofErr w:type="spellStart"/>
+      <w:r>
+        <w:rPr>
+          <w:b/>
+          <w:spacing w:val="-4"/>
+          <w:sz w:val="20"/>
+        </w:rPr>
+        <w:t>items</w:t>
+      </w:r>
+      <w:proofErr w:type="spellEnd"/>
+      <w:r>
+        <w:rPr>
+          <w:b/>
+          <w:spacing w:val="-4"/>
+          <w:sz w:val="20"/>
+        </w:rPr>
+        <w:t>}</w:t>
+      </w:r>
+    </w:p>
+    <w:p>
+      <w:pPr>
+        <w:spacing w:before="1" w:line="252" w:lineRule="auto"/>
+        <w:ind w:right="-61"/>
+        <w:rPr>
+          <w:b/>
+          <w:spacing w:val="-4"/>
+          <w:sz w:val="20"/>
+        </w:rPr>
+      </w:pPr>
+    </w:p>
+    <w:p>
+      <w:pPr>
+        <w:spacing w:before="1" w:line="252" w:lineRule="auto"/>
+        <w:ind w:right="-203"/>
+        <w:rPr>
+          <w:b/>
+          <w:spacing w:val="-4"/>
+          <w:sz w:val="20"/>
+        </w:rPr>
+      </w:pPr>
+    </w:p>
+    <w:p>
+      <w:pPr>
+        <w:rPr>
+          <w:sz w:val="20"/>
+        </w:rPr>
+      </w:pPr>
+    </w:p>
+    <w:p>
+      <w:pPr>
+        <w:rPr>
+          <w:sz w:val="20"/>
+        </w:rPr>
+      </w:pPr>
+    </w:p>
+    <w:p>
+      <w:pPr>
+        <w:rPr>
+          <w:sz w:val="20"/>
+        </w:rPr>
+      </w:pPr>
+    </w:p>
+    <w:p>
+      <w:pPr>
+        <w:rPr>
+          <w:sz w:val="20"/>
+        </w:rPr>
+      </w:pPr>
+    </w:p>
+    <w:p>
+      <w:pPr>
+        <w:rPr>
+          <w:b/>
+          <w:spacing w:val="-4"/>
+          <w:sz w:val="20"/>
+        </w:rPr>
+      </w:pPr>
+    </w:p>
+    <w:p>
+      <w:pPr>
+        <w:tabs>
+          <w:tab w:val="left" w:pos="3486"/>
+        </w:tabs>
+        <w:rPr>
+          <w:sz w:val="20"/>
+        </w:rPr>
+      </w:pPr>
+      <w:r>
+        <w:rPr>
+          <w:sz w:val="20"/>
+        </w:rPr>
+        <w:tab/>
+      </w:r>
     </w:p>
     <w:sectPr>
       <w:type w:val="continuous"/>
       <w:pgSz w:w="12240" w:h="15840"/>
       <w:pgMar w:top="1640" w:right="1080" w:bottom="880" w:left="1440" w:header="0" w:footer="685" w:gutter="0"/>
-      <w:cols w:num="2" w:space="1734" w:equalWidth="0">
-        <w:col w:w="3176" w:space="754"/>
-        <w:col w:w="5790"/>
-      </w:cols>
+      <w:cols w:space="754"/>
     </w:sectPr>
   </w:body>
 </w:document>
@@ -20042,7 +20341,6 @@
       <w:lvlJc w:val="left"/>
       <w:pPr>
         <w:ind w:left="622" w:hanging="360"/>
-        <w:jc w:val="left"/>
       </w:pPr>
       <w:rPr>
         <w:rFonts w:ascii="Trebuchet MS" w:eastAsia="Trebuchet MS" w:hAnsi="Trebuchet MS" w:cs="Trebuchet MS" w:hint="default"/>
@@ -20173,7 +20471,6 @@
       <w:lvlJc w:val="left"/>
       <w:pPr>
         <w:ind w:left="622" w:hanging="360"/>
-        <w:jc w:val="left"/>
       </w:pPr>
       <w:rPr>
         <w:rFonts w:ascii="Trebuchet MS" w:eastAsia="Trebuchet MS" w:hAnsi="Trebuchet MS" w:cs="Trebuchet MS" w:hint="default"/>
@@ -20789,6 +21086,7 @@
   <w:style w:type="paragraph" w:styleId="Textoindependiente">
     <w:name w:val="Body Text"/>
     <w:basedOn w:val="Normal"/>
+    <w:link w:val="TextoindependienteCar"/>
     <w:uiPriority w:val="1"/>
     <w:qFormat/>
     <w:rPr>
@@ -20810,6 +21108,35 @@
     <w:basedOn w:val="Normal"/>
     <w:uiPriority w:val="1"/>
     <w:qFormat/>
+  </w:style>
+  <w:style w:type="table" w:styleId="Tablaconcuadrcula">
+    <w:name w:val="Table Grid"/>
+    <w:basedOn w:val="Tablanormal"/>
+    <w:uiPriority w:val="39"/>
+    <w:rsid w:val="00CE7363"/>
+    <w:tblPr>
+      <w:tblBorders>
+        <w:top w:val="single" w:sz="4" w:space="0" w:color="auto"/>
+        <w:left w:val="single" w:sz="4" w:space="0" w:color="auto"/>
+        <w:bottom w:val="single" w:sz="4" w:space="0" w:color="auto"/>
+        <w:right w:val="single" w:sz="4" w:space="0" w:color="auto"/>
+        <w:insideH w:val="single" w:sz="4" w:space="0" w:color="auto"/>
+        <w:insideV w:val="single" w:sz="4" w:space="0" w:color="auto"/>
+      </w:tblBorders>
+    </w:tblPr>
+  </w:style>
+  <w:style w:type="character" w:customStyle="1" w:styleId="TextoindependienteCar">
+    <w:name w:val="Texto independiente Car"/>
+    <w:basedOn w:val="Fuentedeprrafopredeter"/>
+    <w:link w:val="Textoindependiente"/>
+    <w:uiPriority w:val="1"/>
+    <w:rsid w:val="00D66EA9"/>
+    <w:rPr>
+      <w:rFonts w:ascii="Trebuchet MS" w:eastAsia="Trebuchet MS" w:hAnsi="Trebuchet MS" w:cs="Trebuchet MS"/>
+      <w:sz w:val="20"/>
+      <w:szCs w:val="20"/>
+      <w:lang w:val="es-ES"/>
+    </w:rPr>
   </w:style>
 </w:styles>
 </file>

</xml_diff>

<commit_message>
Corrige tags del anexo técnico para mostrar la tabla de tarifas
</commit_message>
<xml_diff>
--- a/back/src/static/contratos/Anexo Técnico.docx
+++ b/back/src/static/contratos/Anexo Técnico.docx
@@ -962,7 +962,7 @@
                 </mc:Choice>
                 <mc:Fallback>
                   <w:pict>
-                    <v:group w14:anchorId="49D6E8AE" id="Group 3" o:spid="_x0000_s1026" style="position:absolute;margin-left:26.8pt;margin-top:-26.25pt;width:18.7pt;height:19.85pt;z-index:15729152;mso-wrap-distance-left:0;mso-wrap-distance-right:0" coordsize="237490,252095" o:gfxdata="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">
+                    <v:group w14:anchorId="039C0945" id="Group 3" o:spid="_x0000_s1026" style="position:absolute;margin-left:26.8pt;margin-top:-26.25pt;width:18.7pt;height:19.85pt;z-index:15729152;mso-wrap-distance-left:0;mso-wrap-distance-right:0" coordsize="237490,252095" o:gfxdata="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">
                       <v:shapetype id="_x0000_t75" coordsize="21600,21600" o:spt="75" o:preferrelative="t" path="m@4@5l@4@11@9@11@9@5xe" filled="f" stroked="f">
                         <v:stroke joinstyle="miter"/>
                         <v:formulas>
@@ -1316,7 +1316,7 @@
           </mc:Choice>
           <mc:Fallback>
             <w:pict>
-              <v:shape w14:anchorId="0F9D6B72" id="Graphic 5" o:spid="_x0000_s1026" style="position:absolute;margin-left:85.1pt;margin-top:-176.85pt;width:441.45pt;height:164.55pt;z-index:-15995392;visibility:visible;mso-wrap-style:square;mso-wrap-distance-left:0;mso-wrap-distance-top:0;mso-wrap-distance-right:0;mso-wrap-distance-bottom:0;mso-position-horizontal:absolute;mso-position-horizontal-relative:page;mso-position-vertical:absolute;mso-position-vertical-relative:text;v-text-anchor:top" coordsize="5606415,2089785" o:gfxdata="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" path="m2802890,l,,,1475486r,614172l2802890,2089658r,-614172l2802890,xem5606237,l2802966,r,1475486l2802966,2089658r2803271,l5606237,1475486,5606237,xe" fillcolor="#d1d1d1" stroked="f">
+              <v:shape w14:anchorId="15F2BA5B" id="Graphic 5" o:spid="_x0000_s1026" style="position:absolute;margin-left:85.1pt;margin-top:-176.85pt;width:441.45pt;height:164.55pt;z-index:-15995392;visibility:visible;mso-wrap-style:square;mso-wrap-distance-left:0;mso-wrap-distance-top:0;mso-wrap-distance-right:0;mso-wrap-distance-bottom:0;mso-position-horizontal:absolute;mso-position-horizontal-relative:page;mso-position-vertical:absolute;mso-position-vertical-relative:text;v-text-anchor:top" coordsize="5606415,2089785" o:gfxdata="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" path="m2802890,l,,,1475486r,614172l2802890,2089658r,-614172l2802890,xem5606237,l2802966,r,1475486l2802966,2089658r2803271,l5606237,1475486,5606237,xe" fillcolor="#d1d1d1" stroked="f">
                 <v:path arrowok="t"/>
                 <w10:wrap anchorx="page"/>
               </v:shape>
@@ -5763,28 +5763,20 @@
         <w:rPr>
           <w:spacing w:val="-6"/>
         </w:rPr>
-        <w:t xml:space="preserve">con la suscripción de </w:t>
-      </w:r>
-      <w:proofErr w:type="gramStart"/>
+        <w:t>con la suscripción de la</w:t>
+      </w:r>
+      <w:r>
+        <w:rPr>
+          <w:spacing w:val="-7"/>
+        </w:rPr>
+        <w:t xml:space="preserve"> </w:t>
+      </w:r>
       <w:r>
         <w:rPr>
           <w:spacing w:val="-6"/>
         </w:rPr>
-        <w:t>la</w:t>
-      </w:r>
-      <w:r>
-        <w:rPr>
-          <w:spacing w:val="-7"/>
-        </w:rPr>
-        <w:t xml:space="preserve"> </w:t>
-      </w:r>
-      <w:r>
-        <w:rPr>
-          <w:spacing w:val="-6"/>
-        </w:rPr>
         <w:t>mismas</w:t>
       </w:r>
-      <w:proofErr w:type="gramEnd"/>
       <w:r>
         <w:rPr>
           <w:spacing w:val="-7"/>
@@ -18497,23 +18489,7 @@
                 <w:sz w:val="22"/>
                 <w:szCs w:val="22"/>
               </w:rPr>
-              <w:t>C.C.</w:t>
-            </w:r>
-            <w:r>
-              <w:rPr>
-                <w:b/>
-                <w:sz w:val="22"/>
-                <w:szCs w:val="22"/>
-              </w:rPr>
-              <w:t xml:space="preserve"> </w:t>
-            </w:r>
-            <w:r>
-              <w:rPr>
-                <w:b/>
-                <w:sz w:val="22"/>
-                <w:szCs w:val="22"/>
-              </w:rPr>
-              <w:t>{{</w:t>
+              <w:t>C.C. {{</w:t>
             </w:r>
             <w:proofErr w:type="spellStart"/>
             <w:r>
@@ -18558,15 +18534,7 @@
                 <w:sz w:val="22"/>
                 <w:szCs w:val="22"/>
               </w:rPr>
-              <w:t>R</w:t>
-            </w:r>
-            <w:r>
-              <w:rPr>
-                <w:b/>
-                <w:sz w:val="22"/>
-                <w:szCs w:val="22"/>
-              </w:rPr>
-              <w:t>epresentante Legal</w:t>
+              <w:t>Representante Legal</w:t>
             </w:r>
           </w:p>
         </w:tc>
@@ -18754,15 +18722,7 @@
                 <w:sz w:val="22"/>
                 <w:szCs w:val="22"/>
               </w:rPr>
-              <w:t>E</w:t>
-            </w:r>
-            <w:r>
-              <w:rPr>
-                <w:b/>
-                <w:sz w:val="22"/>
-                <w:szCs w:val="22"/>
-              </w:rPr>
-              <w:t>L CONTRATISTA</w:t>
+              <w:t>EL CONTRATISTA</w:t>
             </w:r>
           </w:p>
         </w:tc>
@@ -18902,13 +18862,7 @@
               <w:rPr>
                 <w:b/>
               </w:rPr>
-              <w:t>}}</w:t>
-            </w:r>
-            <w:r>
-              <w:rPr>
-                <w:b/>
-              </w:rPr>
-              <w:t xml:space="preserve"> </w:t>
+              <w:t xml:space="preserve">}} </w:t>
             </w:r>
             <w:r>
               <w:rPr>
@@ -18926,7 +18880,6 @@
               <w:t>NumeroDocumento</w:t>
             </w:r>
             <w:proofErr w:type="spellEnd"/>
-            <w:proofErr w:type="gramStart"/>
             <w:r>
               <w:rPr>
                 <w:b/>
@@ -18940,7 +18893,6 @@
               </w:rPr>
               <w:t xml:space="preserve">   </w:t>
             </w:r>
-            <w:proofErr w:type="gramEnd"/>
           </w:p>
         </w:tc>
       </w:tr>
@@ -19586,156 +19538,97 @@
     <w:p>
       <w:pPr>
         <w:spacing w:before="1" w:line="252" w:lineRule="auto"/>
-        <w:ind w:right="81"/>
-        <w:rPr>
-          <w:b/>
-          <w:spacing w:val="-4"/>
-          <w:sz w:val="20"/>
-        </w:rPr>
-      </w:pPr>
-      <w:r>
-        <w:rPr>
-          <w:b/>
-          <w:spacing w:val="-4"/>
-          <w:sz w:val="20"/>
-        </w:rPr>
-        <w:t>{#items}</w:t>
+        <w:ind w:right="-61"/>
+        <w:rPr>
+          <w:b/>
+          <w:spacing w:val="-4"/>
+          <w:sz w:val="20"/>
+        </w:rPr>
+      </w:pPr>
+      <w:r>
+        <w:rPr>
+          <w:b/>
+          <w:spacing w:val="-4"/>
+          <w:sz w:val="20"/>
+        </w:rPr>
+        <w:t>{{#items}}</w:t>
       </w:r>
     </w:p>
     <w:p>
       <w:pPr>
         <w:spacing w:before="1" w:line="252" w:lineRule="auto"/>
-        <w:ind w:right="81"/>
-        <w:rPr>
-          <w:b/>
-          <w:spacing w:val="-4"/>
-          <w:sz w:val="20"/>
-        </w:rPr>
-      </w:pPr>
-      <w:r>
-        <w:rPr>
-          <w:b/>
-          <w:spacing w:val="-4"/>
-          <w:sz w:val="20"/>
-        </w:rPr>
-        <w:t xml:space="preserve">| {{tipo}} </w:t>
+        <w:ind w:right="-61"/>
+        <w:rPr>
+          <w:b/>
+          <w:spacing w:val="-4"/>
+          <w:sz w:val="20"/>
+        </w:rPr>
+      </w:pPr>
+      <w:r>
+        <w:rPr>
+          <w:b/>
+          <w:spacing w:val="-4"/>
+          <w:sz w:val="20"/>
+        </w:rPr>
+        <w:t>| {{tipo}} | {{cliente}} | {{</w:t>
+      </w:r>
+      <w:proofErr w:type="spellStart"/>
+      <w:r>
+        <w:rPr>
+          <w:b/>
+          <w:spacing w:val="-4"/>
+          <w:sz w:val="20"/>
+        </w:rPr>
+        <w:t>valorTarifa</w:t>
+      </w:r>
+      <w:proofErr w:type="spellEnd"/>
+      <w:r>
+        <w:rPr>
+          <w:b/>
+          <w:spacing w:val="-4"/>
+          <w:sz w:val="20"/>
+        </w:rPr>
+        <w:t>}} | {{</w:t>
+      </w:r>
+      <w:proofErr w:type="spellStart"/>
+      <w:r>
+        <w:rPr>
+          <w:b/>
+          <w:spacing w:val="-4"/>
+          <w:sz w:val="20"/>
+        </w:rPr>
+        <w:t>fechaInicio</w:t>
+      </w:r>
+      <w:proofErr w:type="spellEnd"/>
+      <w:r>
+        <w:rPr>
+          <w:b/>
+          <w:spacing w:val="-4"/>
+          <w:sz w:val="20"/>
+        </w:rPr>
+        <w:t>}} | {{</w:t>
+      </w:r>
+      <w:proofErr w:type="spellStart"/>
+      <w:r>
+        <w:rPr>
+          <w:b/>
+          <w:spacing w:val="-4"/>
+          <w:sz w:val="20"/>
+        </w:rPr>
+        <w:t>fechaFin</w:t>
+      </w:r>
+      <w:proofErr w:type="spellEnd"/>
+      <w:r>
+        <w:rPr>
+          <w:b/>
+          <w:spacing w:val="-4"/>
+          <w:sz w:val="20"/>
+        </w:rPr>
+        <w:t>}} |</w:t>
       </w:r>
     </w:p>
     <w:p>
       <w:pPr>
-        <w:tabs>
-          <w:tab w:val="left" w:pos="4962"/>
-        </w:tabs>
-        <w:spacing w:before="1" w:line="252" w:lineRule="auto"/>
-        <w:ind w:right="81"/>
-        <w:rPr>
-          <w:b/>
-          <w:spacing w:val="-4"/>
-          <w:sz w:val="20"/>
-        </w:rPr>
-      </w:pPr>
-      <w:r>
-        <w:rPr>
-          <w:b/>
-          <w:spacing w:val="-4"/>
-          <w:sz w:val="20"/>
-        </w:rPr>
-        <w:t>| {{cliente}} | {{</w:t>
-      </w:r>
-      <w:proofErr w:type="spellStart"/>
-      <w:r>
-        <w:rPr>
-          <w:b/>
-          <w:spacing w:val="-4"/>
-          <w:sz w:val="20"/>
-        </w:rPr>
-        <w:t>valorTarifa</w:t>
-      </w:r>
-      <w:proofErr w:type="spellEnd"/>
-      <w:r>
-        <w:rPr>
-          <w:b/>
-          <w:spacing w:val="-4"/>
-          <w:sz w:val="20"/>
-        </w:rPr>
-        <w:t>}} | {{</w:t>
-      </w:r>
-      <w:proofErr w:type="spellStart"/>
-      <w:r>
-        <w:rPr>
-          <w:b/>
-          <w:spacing w:val="-4"/>
-          <w:sz w:val="20"/>
-        </w:rPr>
-        <w:t>fechaInicio</w:t>
-      </w:r>
-      <w:proofErr w:type="spellEnd"/>
-      <w:r>
-        <w:rPr>
-          <w:b/>
-          <w:spacing w:val="-4"/>
-          <w:sz w:val="20"/>
-        </w:rPr>
-        <w:t>}} | {{</w:t>
-      </w:r>
-      <w:proofErr w:type="spellStart"/>
-      <w:r>
-        <w:rPr>
-          <w:b/>
-          <w:spacing w:val="-4"/>
-          <w:sz w:val="20"/>
-        </w:rPr>
-        <w:t>fechaFin</w:t>
-      </w:r>
-      <w:proofErr w:type="spellEnd"/>
-      <w:r>
-        <w:rPr>
-          <w:b/>
-          <w:spacing w:val="-4"/>
-          <w:sz w:val="20"/>
-        </w:rPr>
-        <w:t>}} |</w:t>
-      </w:r>
-    </w:p>
-    <w:p>
-      <w:pPr>
-        <w:spacing w:before="1" w:line="252" w:lineRule="auto"/>
-        <w:ind w:right="81"/>
-        <w:rPr>
-          <w:b/>
-          <w:spacing w:val="-4"/>
-          <w:sz w:val="20"/>
-        </w:rPr>
-      </w:pPr>
-      <w:r>
-        <w:rPr>
-          <w:b/>
-          <w:spacing w:val="-4"/>
-          <w:sz w:val="20"/>
-        </w:rPr>
-        <w:t>{/</w:t>
-      </w:r>
-      <w:proofErr w:type="spellStart"/>
-      <w:r>
-        <w:rPr>
-          <w:b/>
-          <w:spacing w:val="-4"/>
-          <w:sz w:val="20"/>
-        </w:rPr>
-        <w:t>items</w:t>
-      </w:r>
-      <w:proofErr w:type="spellEnd"/>
-      <w:r>
-        <w:rPr>
-          <w:b/>
-          <w:spacing w:val="-4"/>
-          <w:sz w:val="20"/>
-        </w:rPr>
-        <w:t>}</w:t>
-      </w:r>
-    </w:p>
-    <w:p>
-      <w:pPr>
         <w:spacing w:before="1" w:line="252" w:lineRule="auto"/>
         <w:ind w:right="-61"/>
         <w:rPr>
@@ -19744,6 +19637,32 @@
           <w:sz w:val="20"/>
         </w:rPr>
       </w:pPr>
+      <w:r>
+        <w:rPr>
+          <w:b/>
+          <w:spacing w:val="-4"/>
+          <w:sz w:val="20"/>
+        </w:rPr>
+        <w:t>{{/</w:t>
+      </w:r>
+      <w:proofErr w:type="spellStart"/>
+      <w:r>
+        <w:rPr>
+          <w:b/>
+          <w:spacing w:val="-4"/>
+          <w:sz w:val="20"/>
+        </w:rPr>
+        <w:t>items</w:t>
+      </w:r>
+      <w:proofErr w:type="spellEnd"/>
+      <w:r>
+        <w:rPr>
+          <w:b/>
+          <w:spacing w:val="-4"/>
+          <w:sz w:val="20"/>
+        </w:rPr>
+        <w:t>}}</w:t>
+      </w:r>
     </w:p>
     <w:p>
       <w:pPr>

</xml_diff>

<commit_message>
Mejorar visual de tabla de items en plantilla Anexo Tecnico
</commit_message>
<xml_diff>
--- a/back/src/static/contratos/Anexo Técnico.docx
+++ b/back/src/static/contratos/Anexo Técnico.docx
@@ -19535,135 +19535,211 @@
         <w:t xml:space="preserve"> </w:t>
       </w:r>
     </w:p>
-    <w:p>
-      <w:pPr>
-        <w:spacing w:before="1" w:line="252" w:lineRule="auto"/>
-        <w:ind w:right="-61"/>
-        <w:rPr>
-          <w:b/>
-          <w:spacing w:val="-4"/>
-          <w:sz w:val="20"/>
-        </w:rPr>
-      </w:pPr>
-      <w:r>
-        <w:rPr>
-          <w:b/>
-          <w:spacing w:val="-4"/>
-          <w:sz w:val="20"/>
-        </w:rPr>
-        <w:t>{{#items}}</w:t>
-      </w:r>
-    </w:p>
-    <w:p>
-      <w:pPr>
-        <w:spacing w:before="1" w:line="252" w:lineRule="auto"/>
-        <w:ind w:right="-61"/>
-        <w:rPr>
-          <w:b/>
-          <w:spacing w:val="-4"/>
-          <w:sz w:val="20"/>
-        </w:rPr>
-      </w:pPr>
-      <w:r>
-        <w:rPr>
-          <w:b/>
-          <w:spacing w:val="-4"/>
-          <w:sz w:val="20"/>
-        </w:rPr>
-        <w:t>| {{tipo}} | {{cliente}} | {{</w:t>
-      </w:r>
-      <w:proofErr w:type="spellStart"/>
-      <w:r>
-        <w:rPr>
-          <w:b/>
-          <w:spacing w:val="-4"/>
-          <w:sz w:val="20"/>
-        </w:rPr>
-        <w:t>valorTarifa</w:t>
-      </w:r>
-      <w:proofErr w:type="spellEnd"/>
-      <w:r>
-        <w:rPr>
-          <w:b/>
-          <w:spacing w:val="-4"/>
-          <w:sz w:val="20"/>
-        </w:rPr>
-        <w:t>}} | {{</w:t>
-      </w:r>
-      <w:proofErr w:type="spellStart"/>
-      <w:r>
-        <w:rPr>
-          <w:b/>
-          <w:spacing w:val="-4"/>
-          <w:sz w:val="20"/>
-        </w:rPr>
-        <w:t>fechaInicio</w:t>
-      </w:r>
-      <w:proofErr w:type="spellEnd"/>
-      <w:r>
-        <w:rPr>
-          <w:b/>
-          <w:spacing w:val="-4"/>
-          <w:sz w:val="20"/>
-        </w:rPr>
-        <w:t>}} | {{</w:t>
-      </w:r>
-      <w:proofErr w:type="spellStart"/>
-      <w:r>
-        <w:rPr>
-          <w:b/>
-          <w:spacing w:val="-4"/>
-          <w:sz w:val="20"/>
-        </w:rPr>
-        <w:t>fechaFin</w:t>
-      </w:r>
-      <w:proofErr w:type="spellEnd"/>
-      <w:r>
-        <w:rPr>
-          <w:b/>
-          <w:spacing w:val="-4"/>
-          <w:sz w:val="20"/>
-        </w:rPr>
-        <w:t>}} |</w:t>
-      </w:r>
-    </w:p>
-    <w:p>
-      <w:pPr>
-        <w:spacing w:before="1" w:line="252" w:lineRule="auto"/>
-        <w:ind w:right="-61"/>
-        <w:rPr>
-          <w:b/>
-          <w:spacing w:val="-4"/>
-          <w:sz w:val="20"/>
-        </w:rPr>
-      </w:pPr>
-      <w:r>
-        <w:rPr>
-          <w:b/>
-          <w:spacing w:val="-4"/>
-          <w:sz w:val="20"/>
-        </w:rPr>
-        <w:t>{{/</w:t>
-      </w:r>
-      <w:proofErr w:type="spellStart"/>
-      <w:r>
-        <w:rPr>
-          <w:b/>
-          <w:spacing w:val="-4"/>
-          <w:sz w:val="20"/>
-        </w:rPr>
-        <w:t>items</w:t>
-      </w:r>
-      <w:proofErr w:type="spellEnd"/>
-      <w:r>
-        <w:rPr>
-          <w:b/>
-          <w:spacing w:val="-4"/>
-          <w:sz w:val="20"/>
-        </w:rPr>
-        <w:t>}}</w:t>
-      </w:r>
-    </w:p>
+    <w:tbl xmlns:w="http://schemas.openxmlformats.org/wordprocessingml/2006/main">
+      <w:tblPr>
+        <w:tblW w:w="0" w:type="auto"/>
+        <w:tblLayout w:type="fixed"/>
+        <w:tblBorders>
+          <w:top w:val="single" w:sz="6" w:space="0" w:color="D0D7DE"/>
+          <w:left w:val="single" w:sz="6" w:space="0" w:color="D0D7DE"/>
+          <w:bottom w:val="single" w:sz="6" w:space="0" w:color="D0D7DE"/>
+          <w:right w:val="single" w:sz="6" w:space="0" w:color="D0D7DE"/>
+          <w:insideH w:val="single" w:sz="6" w:space="0" w:color="D0D7DE"/>
+          <w:insideV w:val="single" w:sz="6" w:space="0" w:color="D0D7DE"/>
+        </w:tblBorders>
+        <w:tblLook w:val="04A0" w:firstRow="1" w:lastRow="0" w:firstColumn="0" w:lastColumn="0" w:noHBand="1" w:noVBand="1"/>
+      </w:tblPr>
+      <w:tblGrid>
+        <w:gridCol w:w="1538"/>
+        <w:gridCol w:w="2051"/>
+        <w:gridCol w:w="2563"/>
+        <w:gridCol w:w="1794"/>
+        <w:gridCol w:w="1794"/>
+      </w:tblGrid>
+      <w:tr>
+        <w:trPr>
+          <w:trHeight w:val="420"/>
+        </w:trPr>
+        <w:tc>
+          <w:tcPr>
+            <w:tcW w:w="1538" w:type="dxa"/>
+            <w:shd w:val="clear" w:color="auto" w:fill="20272F"/>
+            <w:vAlign w:val="center"/>
+          </w:tcPr>
+          <w:p>
+            <w:pPr>
+              <w:jc w:val="center"/>
+            </w:pPr>
+            <w:r>
+              <w:rPr>
+                <w:b/>
+                <w:color w:val="FFFFFF"/>
+                <w:sz w:val="20"/>
+              </w:rPr>
+              <w:t>Tipo</w:t>
+            </w:r>
+          </w:p>
+        </w:tc>
+        <w:tc>
+          <w:tcPr>
+            <w:tcW w:w="2051" w:type="dxa"/>
+            <w:shd w:val="clear" w:color="auto" w:fill="20272F"/>
+            <w:vAlign w:val="center"/>
+          </w:tcPr>
+          <w:p>
+            <w:pPr>
+              <w:jc w:val="center"/>
+            </w:pPr>
+            <w:r>
+              <w:rPr>
+                <w:b/>
+                <w:color w:val="FFFFFF"/>
+                <w:sz w:val="20"/>
+              </w:rPr>
+              <w:t>Cliente</w:t>
+            </w:r>
+          </w:p>
+        </w:tc>
+        <w:tc>
+          <w:tcPr>
+            <w:tcW w:w="2563" w:type="dxa"/>
+            <w:shd w:val="clear" w:color="auto" w:fill="20272F"/>
+            <w:vAlign w:val="center"/>
+          </w:tcPr>
+          <w:p>
+            <w:pPr>
+              <w:jc w:val="center"/>
+            </w:pPr>
+            <w:r>
+              <w:rPr>
+                <w:b/>
+                <w:color w:val="FFFFFF"/>
+                <w:sz w:val="20"/>
+              </w:rPr>
+              <w:t>Valor / Tarifa</w:t>
+            </w:r>
+          </w:p>
+        </w:tc>
+        <w:tc>
+          <w:tcPr>
+            <w:tcW w:w="1794" w:type="dxa"/>
+            <w:shd w:val="clear" w:color="auto" w:fill="20272F"/>
+            <w:vAlign w:val="center"/>
+          </w:tcPr>
+          <w:p>
+            <w:pPr>
+              <w:jc w:val="center"/>
+            </w:pPr>
+            <w:r>
+              <w:rPr>
+                <w:b/>
+                <w:color w:val="FFFFFF"/>
+                <w:sz w:val="20"/>
+              </w:rPr>
+              <w:t>Fecha inicio</w:t>
+            </w:r>
+          </w:p>
+        </w:tc>
+        <w:tc>
+          <w:tcPr>
+            <w:tcW w:w="1794" w:type="dxa"/>
+            <w:shd w:val="clear" w:color="auto" w:fill="20272F"/>
+            <w:vAlign w:val="center"/>
+          </w:tcPr>
+          <w:p>
+            <w:pPr>
+              <w:jc w:val="center"/>
+            </w:pPr>
+            <w:r>
+              <w:rPr>
+                <w:b/>
+                <w:color w:val="FFFFFF"/>
+                <w:sz w:val="20"/>
+              </w:rPr>
+              <w:t>Fecha fin</w:t>
+            </w:r>
+          </w:p>
+        </w:tc>
+      </w:tr>
+      <w:tr>
+        <w:tc>
+          <w:tcPr>
+            <w:tcW w:w="1538" w:type="dxa"/>
+            <w:vAlign w:val="center"/>
+          </w:tcPr>
+          <w:p>
+            <w:r>
+              <w:rPr>
+                <w:sz w:val="20"/>
+              </w:rPr>
+              <w:t>{{#items}}{{tipo}}</w:t>
+            </w:r>
+          </w:p>
+        </w:tc>
+        <w:tc>
+          <w:tcPr>
+            <w:tcW w:w="2051" w:type="dxa"/>
+            <w:vAlign w:val="center"/>
+          </w:tcPr>
+          <w:p>
+            <w:r>
+              <w:rPr>
+                <w:sz w:val="20"/>
+              </w:rPr>
+              <w:t>{{cliente}}</w:t>
+            </w:r>
+          </w:p>
+        </w:tc>
+        <w:tc>
+          <w:tcPr>
+            <w:tcW w:w="2563" w:type="dxa"/>
+            <w:vAlign w:val="center"/>
+          </w:tcPr>
+          <w:p>
+            <w:r>
+              <w:rPr>
+                <w:sz w:val="20"/>
+              </w:rPr>
+              <w:t>{{valorTarifa}}</w:t>
+            </w:r>
+          </w:p>
+        </w:tc>
+        <w:tc>
+          <w:tcPr>
+            <w:tcW w:w="1794" w:type="dxa"/>
+            <w:vAlign w:val="center"/>
+          </w:tcPr>
+          <w:p>
+            <w:pPr>
+              <w:jc w:val="center"/>
+            </w:pPr>
+            <w:r>
+              <w:rPr>
+                <w:sz w:val="20"/>
+              </w:rPr>
+              <w:t>{{fechaInicio}}</w:t>
+            </w:r>
+          </w:p>
+        </w:tc>
+        <w:tc>
+          <w:tcPr>
+            <w:tcW w:w="1794" w:type="dxa"/>
+            <w:vAlign w:val="center"/>
+          </w:tcPr>
+          <w:p>
+            <w:pPr>
+              <w:jc w:val="center"/>
+            </w:pPr>
+            <w:r>
+              <w:rPr>
+                <w:sz w:val="20"/>
+              </w:rPr>
+              <w:t>{{fechaFin}}{{/items}}</w:t>
+            </w:r>
+          </w:p>
+        </w:tc>
+      </w:tr>
+    </w:tbl>
     <w:p>
       <w:pPr>
         <w:spacing w:before="1" w:line="252" w:lineRule="auto"/>

</xml_diff>

<commit_message>
Unifica flujo RRHH, contratacion y revision TH
Alinea estados entre preregistro y solicitudes_contratacion.\nPrioriza la solicitud RRHH como caso operativo en TH.\nAgrega migraciones de compatibilidad para estados y azure_oid.\nCorrige la persistencia de anexo tecnico en el flujo unificado.
</commit_message>
<xml_diff>
--- a/back/src/static/contratos/Anexo Técnico.docx
+++ b/back/src/static/contratos/Anexo Técnico.docx
@@ -962,7 +962,7 @@
                 </mc:Choice>
                 <mc:Fallback>
                   <w:pict>
-                    <v:group w14:anchorId="039C0945" id="Group 3" o:spid="_x0000_s1026" style="position:absolute;margin-left:26.8pt;margin-top:-26.25pt;width:18.7pt;height:19.85pt;z-index:15729152;mso-wrap-distance-left:0;mso-wrap-distance-right:0" coordsize="237490,252095" o:gfxdata="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">
+                    <v:group w14:anchorId="3100AED8" id="Group 3" o:spid="_x0000_s1026" style="position:absolute;margin-left:26.8pt;margin-top:-26.25pt;width:18.7pt;height:19.85pt;z-index:15729152;mso-wrap-distance-left:0;mso-wrap-distance-right:0" coordsize="237490,252095" o:gfxdata="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">
                       <v:shapetype id="_x0000_t75" coordsize="21600,21600" o:spt="75" o:preferrelative="t" path="m@4@5l@4@11@9@11@9@5xe" filled="f" stroked="f">
                         <v:stroke joinstyle="miter"/>
                         <v:formulas>
@@ -1316,7 +1316,7 @@
           </mc:Choice>
           <mc:Fallback>
             <w:pict>
-              <v:shape w14:anchorId="15F2BA5B" id="Graphic 5" o:spid="_x0000_s1026" style="position:absolute;margin-left:85.1pt;margin-top:-176.85pt;width:441.45pt;height:164.55pt;z-index:-15995392;visibility:visible;mso-wrap-style:square;mso-wrap-distance-left:0;mso-wrap-distance-top:0;mso-wrap-distance-right:0;mso-wrap-distance-bottom:0;mso-position-horizontal:absolute;mso-position-horizontal-relative:page;mso-position-vertical:absolute;mso-position-vertical-relative:text;v-text-anchor:top" coordsize="5606415,2089785" o:gfxdata="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" path="m2802890,l,,,1475486r,614172l2802890,2089658r,-614172l2802890,xem5606237,l2802966,r,1475486l2802966,2089658r2803271,l5606237,1475486,5606237,xe" fillcolor="#d1d1d1" stroked="f">
+              <v:shape w14:anchorId="3BF2F32B" id="Graphic 5" o:spid="_x0000_s1026" style="position:absolute;margin-left:85.1pt;margin-top:-176.85pt;width:441.45pt;height:164.55pt;z-index:-15995392;visibility:visible;mso-wrap-style:square;mso-wrap-distance-left:0;mso-wrap-distance-top:0;mso-wrap-distance-right:0;mso-wrap-distance-bottom:0;mso-position-horizontal:absolute;mso-position-horizontal-relative:page;mso-position-vertical:absolute;mso-position-vertical-relative:text;v-text-anchor:top" coordsize="5606415,2089785" o:gfxdata="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" path="m2802890,l,,,1475486r,614172l2802890,2089658r,-614172l2802890,xem5606237,l2802966,r,1475486l2802966,2089658r2803271,l5606237,1475486,5606237,xe" fillcolor="#d1d1d1" stroked="f">
                 <v:path arrowok="t"/>
                 <w10:wrap anchorx="page"/>
               </v:shape>
@@ -5763,7 +5763,14 @@
         <w:rPr>
           <w:spacing w:val="-6"/>
         </w:rPr>
-        <w:t>con la suscripción de la</w:t>
+        <w:t xml:space="preserve">con la suscripción de </w:t>
+      </w:r>
+      <w:proofErr w:type="gramStart"/>
+      <w:r>
+        <w:rPr>
+          <w:spacing w:val="-6"/>
+        </w:rPr>
+        <w:t>la</w:t>
       </w:r>
       <w:r>
         <w:rPr>
@@ -5777,6 +5784,7 @@
         </w:rPr>
         <w:t>mismas</w:t>
       </w:r>
+      <w:proofErr w:type="gramEnd"/>
       <w:r>
         <w:rPr>
           <w:spacing w:val="-7"/>
@@ -6027,6 +6035,7 @@
         </w:rPr>
         <w:t xml:space="preserve"> </w:t>
       </w:r>
+      <w:proofErr w:type="gramStart"/>
       <w:r>
         <w:rPr>
           <w:spacing w:val="-4"/>
@@ -6034,6 +6043,7 @@
         </w:rPr>
         <w:t>Ticket</w:t>
       </w:r>
+      <w:proofErr w:type="gramEnd"/>
       <w:r>
         <w:rPr>
           <w:spacing w:val="-6"/>
@@ -6877,12 +6887,14 @@
         </w:rPr>
         <w:t xml:space="preserve"> </w:t>
       </w:r>
+      <w:proofErr w:type="gramStart"/>
       <w:r>
         <w:rPr>
           <w:sz w:val="20"/>
         </w:rPr>
         <w:t>Tickets</w:t>
       </w:r>
+      <w:proofErr w:type="gramEnd"/>
       <w:r>
         <w:rPr>
           <w:spacing w:val="-7"/>
@@ -15329,6 +15341,7 @@
         </w:rPr>
         <w:t xml:space="preserve"> </w:t>
       </w:r>
+      <w:proofErr w:type="gramStart"/>
       <w:r>
         <w:rPr>
           <w:spacing w:val="-2"/>
@@ -15350,6 +15363,7 @@
         </w:rPr>
         <w:t>,</w:t>
       </w:r>
+      <w:proofErr w:type="gramEnd"/>
       <w:r>
         <w:rPr>
           <w:spacing w:val="-15"/>
@@ -15385,6 +15399,7 @@
         </w:rPr>
         <w:t xml:space="preserve"> </w:t>
       </w:r>
+      <w:proofErr w:type="gramStart"/>
       <w:r>
         <w:rPr>
           <w:spacing w:val="-2"/>
@@ -15392,6 +15407,7 @@
         </w:rPr>
         <w:t>Ticket</w:t>
       </w:r>
+      <w:proofErr w:type="gramEnd"/>
       <w:r>
         <w:rPr>
           <w:spacing w:val="-15"/>
@@ -18318,6 +18334,28 @@
       <w:pPr>
         <w:spacing w:before="1" w:line="280" w:lineRule="auto"/>
         <w:ind w:left="720"/>
+      </w:pPr>
+    </w:p>
+    <w:p>
+      <w:pPr>
+        <w:spacing w:before="1" w:line="280" w:lineRule="auto"/>
+        <w:ind w:left="720"/>
+      </w:pPr>
+    </w:p>
+    <w:p>
+      <w:pPr>
+        <w:spacing w:before="1" w:line="280" w:lineRule="auto"/>
+        <w:ind w:left="720"/>
+      </w:pPr>
+    </w:p>
+    <w:p>
+      <w:pPr>
+        <w:spacing w:before="1" w:line="280" w:lineRule="auto"/>
+      </w:pPr>
+    </w:p>
+    <w:p>
+      <w:pPr>
+        <w:spacing w:before="1" w:line="280" w:lineRule="auto"/>
         <w:rPr>
           <w:rFonts w:ascii="Tahoma"/>
           <w:b/>
@@ -18329,9 +18367,6 @@
           <w:cols w:space="754"/>
         </w:sectPr>
       </w:pPr>
-      <w:r>
-        <w:br w:type="column"/>
-      </w:r>
     </w:p>
     <w:p>
       <w:pPr>
@@ -18652,41 +18687,11 @@
         </w:rPr>
       </w:pPr>
     </w:p>
-    <w:p>
-      <w:pPr>
-        <w:spacing w:before="1" w:line="252" w:lineRule="auto"/>
-        <w:ind w:right="4650"/>
-        <w:rPr>
-          <w:b/>
-          <w:spacing w:val="-4"/>
-        </w:rPr>
-      </w:pPr>
-    </w:p>
-    <w:p>
-      <w:pPr>
-        <w:spacing w:before="1" w:line="252" w:lineRule="auto"/>
-        <w:ind w:right="4650"/>
-        <w:rPr>
-          <w:b/>
-          <w:spacing w:val="-4"/>
-        </w:rPr>
-      </w:pPr>
-    </w:p>
-    <w:p>
-      <w:pPr>
-        <w:spacing w:before="1" w:line="252" w:lineRule="auto"/>
-        <w:ind w:right="4650"/>
-        <w:rPr>
-          <w:b/>
-          <w:spacing w:val="-4"/>
-        </w:rPr>
-      </w:pPr>
-    </w:p>
     <w:tbl>
       <w:tblPr>
         <w:tblStyle w:val="Tablaconcuadrcula"/>
+        <w:tblpPr w:leftFromText="141" w:rightFromText="141" w:horzAnchor="margin" w:tblpXSpec="right" w:tblpY="225"/>
         <w:tblW w:w="0" w:type="auto"/>
-        <w:tblInd w:w="38" w:type="dxa"/>
         <w:tblBorders>
           <w:top w:val="none" w:sz="0" w:space="0" w:color="auto"/>
           <w:left w:val="none" w:sz="0" w:space="0" w:color="auto"/>
@@ -18702,6 +18707,9 @@
         <w:gridCol w:w="2069"/>
       </w:tblGrid>
       <w:tr>
+        <w:trPr>
+          <w:trHeight w:val="416"/>
+        </w:trPr>
         <w:tc>
           <w:tcPr>
             <w:tcW w:w="2592" w:type="dxa"/>
@@ -18880,6 +18888,7 @@
               <w:t>NumeroDocumento</w:t>
             </w:r>
             <w:proofErr w:type="spellEnd"/>
+            <w:proofErr w:type="gramStart"/>
             <w:r>
               <w:rPr>
                 <w:b/>
@@ -18893,6 +18902,7 @@
               </w:rPr>
               <w:t xml:space="preserve">   </w:t>
             </w:r>
+            <w:proofErr w:type="gramEnd"/>
           </w:p>
         </w:tc>
       </w:tr>
@@ -19018,39 +19028,14 @@
           <w:sz w:val="20"/>
         </w:rPr>
       </w:pPr>
-    </w:p>
-    <w:p>
-      <w:pPr>
-        <w:spacing w:before="1" w:line="252" w:lineRule="auto"/>
-        <w:ind w:right="4650"/>
+      <w:r>
         <w:rPr>
           <w:b/>
           <w:spacing w:val="-4"/>
           <w:sz w:val="20"/>
         </w:rPr>
-      </w:pPr>
-    </w:p>
-    <w:p>
-      <w:pPr>
-        <w:spacing w:before="1" w:line="252" w:lineRule="auto"/>
-        <w:ind w:right="4650"/>
-        <w:rPr>
-          <w:b/>
-          <w:spacing w:val="-4"/>
-          <w:sz w:val="20"/>
-        </w:rPr>
-      </w:pPr>
-    </w:p>
-    <w:p>
-      <w:pPr>
-        <w:spacing w:before="1" w:line="252" w:lineRule="auto"/>
-        <w:ind w:right="4650"/>
-        <w:rPr>
-          <w:b/>
-          <w:spacing w:val="-4"/>
-          <w:sz w:val="20"/>
-        </w:rPr>
-      </w:pPr>
+        <w:t xml:space="preserve">    </w:t>
+      </w:r>
     </w:p>
     <w:p>
       <w:pPr>
@@ -19072,402 +19057,6 @@
     <w:p>
       <w:pPr>
         <w:spacing w:before="1" w:line="252" w:lineRule="auto"/>
-        <w:ind w:right="4650"/>
-        <w:rPr>
-          <w:b/>
-          <w:spacing w:val="-4"/>
-          <w:sz w:val="20"/>
-        </w:rPr>
-      </w:pPr>
-    </w:p>
-    <w:p>
-      <w:pPr>
-        <w:spacing w:before="1" w:line="252" w:lineRule="auto"/>
-        <w:ind w:right="4650"/>
-        <w:rPr>
-          <w:b/>
-          <w:spacing w:val="-4"/>
-          <w:sz w:val="20"/>
-        </w:rPr>
-      </w:pPr>
-    </w:p>
-    <w:p>
-      <w:pPr>
-        <w:spacing w:before="1" w:line="252" w:lineRule="auto"/>
-        <w:ind w:right="4650"/>
-        <w:rPr>
-          <w:b/>
-          <w:spacing w:val="-4"/>
-          <w:sz w:val="20"/>
-        </w:rPr>
-      </w:pPr>
-    </w:p>
-    <w:p>
-      <w:pPr>
-        <w:spacing w:before="1" w:line="252" w:lineRule="auto"/>
-        <w:ind w:right="4650"/>
-        <w:rPr>
-          <w:b/>
-          <w:spacing w:val="-4"/>
-          <w:sz w:val="20"/>
-        </w:rPr>
-      </w:pPr>
-    </w:p>
-    <w:p>
-      <w:pPr>
-        <w:spacing w:before="1" w:line="252" w:lineRule="auto"/>
-        <w:ind w:right="4650"/>
-        <w:rPr>
-          <w:b/>
-          <w:spacing w:val="-4"/>
-          <w:sz w:val="20"/>
-        </w:rPr>
-      </w:pPr>
-    </w:p>
-    <w:p>
-      <w:pPr>
-        <w:spacing w:before="1" w:line="252" w:lineRule="auto"/>
-        <w:ind w:right="4650"/>
-        <w:rPr>
-          <w:b/>
-          <w:spacing w:val="-4"/>
-          <w:sz w:val="20"/>
-        </w:rPr>
-      </w:pPr>
-    </w:p>
-    <w:p>
-      <w:pPr>
-        <w:spacing w:before="1" w:line="252" w:lineRule="auto"/>
-        <w:ind w:right="4650"/>
-        <w:rPr>
-          <w:b/>
-          <w:spacing w:val="-4"/>
-          <w:sz w:val="20"/>
-        </w:rPr>
-      </w:pPr>
-    </w:p>
-    <w:p>
-      <w:pPr>
-        <w:spacing w:before="1" w:line="252" w:lineRule="auto"/>
-        <w:ind w:right="4650"/>
-        <w:rPr>
-          <w:b/>
-          <w:spacing w:val="-4"/>
-          <w:sz w:val="20"/>
-        </w:rPr>
-      </w:pPr>
-    </w:p>
-    <w:p>
-      <w:pPr>
-        <w:spacing w:before="1" w:line="252" w:lineRule="auto"/>
-        <w:ind w:right="4650"/>
-        <w:rPr>
-          <w:b/>
-          <w:spacing w:val="-4"/>
-          <w:sz w:val="20"/>
-        </w:rPr>
-      </w:pPr>
-    </w:p>
-    <w:p>
-      <w:pPr>
-        <w:spacing w:before="1" w:line="252" w:lineRule="auto"/>
-        <w:ind w:right="4650"/>
-        <w:rPr>
-          <w:b/>
-          <w:spacing w:val="-4"/>
-          <w:sz w:val="20"/>
-        </w:rPr>
-      </w:pPr>
-    </w:p>
-    <w:p>
-      <w:pPr>
-        <w:spacing w:before="1" w:line="252" w:lineRule="auto"/>
-        <w:ind w:right="4650"/>
-        <w:rPr>
-          <w:b/>
-          <w:spacing w:val="-4"/>
-          <w:sz w:val="20"/>
-        </w:rPr>
-      </w:pPr>
-    </w:p>
-    <w:p>
-      <w:pPr>
-        <w:spacing w:before="1" w:line="252" w:lineRule="auto"/>
-        <w:ind w:right="4650"/>
-        <w:rPr>
-          <w:b/>
-          <w:spacing w:val="-4"/>
-          <w:sz w:val="20"/>
-        </w:rPr>
-      </w:pPr>
-    </w:p>
-    <w:p>
-      <w:pPr>
-        <w:spacing w:before="1" w:line="252" w:lineRule="auto"/>
-        <w:ind w:right="4650"/>
-        <w:rPr>
-          <w:b/>
-          <w:spacing w:val="-4"/>
-          <w:sz w:val="20"/>
-        </w:rPr>
-      </w:pPr>
-    </w:p>
-    <w:p>
-      <w:pPr>
-        <w:spacing w:before="1" w:line="252" w:lineRule="auto"/>
-        <w:ind w:right="4650"/>
-        <w:rPr>
-          <w:b/>
-          <w:spacing w:val="-4"/>
-          <w:sz w:val="20"/>
-        </w:rPr>
-      </w:pPr>
-    </w:p>
-    <w:p>
-      <w:pPr>
-        <w:spacing w:before="1" w:line="252" w:lineRule="auto"/>
-        <w:ind w:right="4650"/>
-        <w:rPr>
-          <w:b/>
-          <w:spacing w:val="-4"/>
-          <w:sz w:val="20"/>
-        </w:rPr>
-      </w:pPr>
-    </w:p>
-    <w:p>
-      <w:pPr>
-        <w:spacing w:before="1" w:line="252" w:lineRule="auto"/>
-        <w:ind w:right="4650"/>
-        <w:rPr>
-          <w:b/>
-          <w:spacing w:val="-4"/>
-          <w:sz w:val="20"/>
-        </w:rPr>
-      </w:pPr>
-    </w:p>
-    <w:p>
-      <w:pPr>
-        <w:spacing w:before="1" w:line="252" w:lineRule="auto"/>
-        <w:ind w:right="4650"/>
-        <w:rPr>
-          <w:b/>
-          <w:spacing w:val="-4"/>
-          <w:sz w:val="20"/>
-        </w:rPr>
-      </w:pPr>
-    </w:p>
-    <w:p>
-      <w:pPr>
-        <w:spacing w:before="1" w:line="252" w:lineRule="auto"/>
-        <w:ind w:right="4650"/>
-        <w:rPr>
-          <w:b/>
-          <w:spacing w:val="-4"/>
-          <w:sz w:val="20"/>
-        </w:rPr>
-      </w:pPr>
-    </w:p>
-    <w:p>
-      <w:pPr>
-        <w:spacing w:before="1" w:line="252" w:lineRule="auto"/>
-        <w:ind w:right="4650"/>
-        <w:rPr>
-          <w:b/>
-          <w:spacing w:val="-4"/>
-          <w:sz w:val="20"/>
-        </w:rPr>
-      </w:pPr>
-    </w:p>
-    <w:p>
-      <w:pPr>
-        <w:spacing w:before="1" w:line="252" w:lineRule="auto"/>
-        <w:ind w:right="4650"/>
-        <w:rPr>
-          <w:b/>
-          <w:spacing w:val="-4"/>
-          <w:sz w:val="20"/>
-        </w:rPr>
-      </w:pPr>
-    </w:p>
-    <w:p>
-      <w:pPr>
-        <w:spacing w:before="1" w:line="252" w:lineRule="auto"/>
-        <w:ind w:right="4650"/>
-        <w:rPr>
-          <w:b/>
-          <w:spacing w:val="-4"/>
-          <w:sz w:val="20"/>
-        </w:rPr>
-      </w:pPr>
-    </w:p>
-    <w:p>
-      <w:pPr>
-        <w:spacing w:before="1" w:line="252" w:lineRule="auto"/>
-        <w:ind w:right="4650"/>
-        <w:rPr>
-          <w:b/>
-          <w:spacing w:val="-4"/>
-          <w:sz w:val="20"/>
-        </w:rPr>
-      </w:pPr>
-    </w:p>
-    <w:p>
-      <w:pPr>
-        <w:spacing w:before="1" w:line="252" w:lineRule="auto"/>
-        <w:ind w:right="4650"/>
-        <w:rPr>
-          <w:b/>
-          <w:spacing w:val="-4"/>
-          <w:sz w:val="20"/>
-        </w:rPr>
-      </w:pPr>
-    </w:p>
-    <w:p>
-      <w:pPr>
-        <w:spacing w:before="1" w:line="252" w:lineRule="auto"/>
-        <w:ind w:right="4650"/>
-        <w:rPr>
-          <w:b/>
-          <w:spacing w:val="-4"/>
-          <w:sz w:val="20"/>
-        </w:rPr>
-      </w:pPr>
-    </w:p>
-    <w:p>
-      <w:pPr>
-        <w:spacing w:before="1" w:line="252" w:lineRule="auto"/>
-        <w:ind w:right="4650"/>
-        <w:rPr>
-          <w:b/>
-          <w:spacing w:val="-4"/>
-          <w:sz w:val="20"/>
-        </w:rPr>
-      </w:pPr>
-    </w:p>
-    <w:p>
-      <w:pPr>
-        <w:spacing w:before="1" w:line="252" w:lineRule="auto"/>
-        <w:ind w:right="4650"/>
-        <w:rPr>
-          <w:b/>
-          <w:spacing w:val="-4"/>
-          <w:sz w:val="20"/>
-        </w:rPr>
-      </w:pPr>
-    </w:p>
-    <w:p>
-      <w:pPr>
-        <w:spacing w:before="1" w:line="252" w:lineRule="auto"/>
-        <w:ind w:right="4650"/>
-        <w:rPr>
-          <w:b/>
-          <w:spacing w:val="-4"/>
-          <w:sz w:val="20"/>
-        </w:rPr>
-      </w:pPr>
-    </w:p>
-    <w:p>
-      <w:pPr>
-        <w:spacing w:before="1" w:line="252" w:lineRule="auto"/>
-        <w:ind w:right="4650"/>
-        <w:rPr>
-          <w:b/>
-          <w:spacing w:val="-4"/>
-          <w:sz w:val="20"/>
-        </w:rPr>
-      </w:pPr>
-    </w:p>
-    <w:p>
-      <w:pPr>
-        <w:spacing w:before="1" w:line="252" w:lineRule="auto"/>
-        <w:ind w:right="4650"/>
-        <w:rPr>
-          <w:b/>
-          <w:spacing w:val="-4"/>
-          <w:sz w:val="20"/>
-        </w:rPr>
-      </w:pPr>
-    </w:p>
-    <w:p>
-      <w:pPr>
-        <w:spacing w:before="1" w:line="252" w:lineRule="auto"/>
-        <w:ind w:right="4650"/>
-        <w:rPr>
-          <w:b/>
-          <w:spacing w:val="-4"/>
-          <w:sz w:val="20"/>
-        </w:rPr>
-      </w:pPr>
-    </w:p>
-    <w:p>
-      <w:pPr>
-        <w:spacing w:before="1" w:line="252" w:lineRule="auto"/>
-        <w:ind w:right="4650"/>
-        <w:rPr>
-          <w:b/>
-          <w:spacing w:val="-4"/>
-          <w:sz w:val="20"/>
-        </w:rPr>
-      </w:pPr>
-    </w:p>
-    <w:p>
-      <w:pPr>
-        <w:spacing w:before="1" w:line="252" w:lineRule="auto"/>
-        <w:ind w:right="4650"/>
-        <w:rPr>
-          <w:b/>
-          <w:spacing w:val="-4"/>
-          <w:sz w:val="20"/>
-        </w:rPr>
-      </w:pPr>
-    </w:p>
-    <w:p>
-      <w:pPr>
-        <w:spacing w:before="1" w:line="252" w:lineRule="auto"/>
-        <w:ind w:right="4650"/>
-        <w:rPr>
-          <w:b/>
-          <w:spacing w:val="-4"/>
-          <w:sz w:val="20"/>
-        </w:rPr>
-      </w:pPr>
-    </w:p>
-    <w:p>
-      <w:pPr>
-        <w:spacing w:before="1" w:line="252" w:lineRule="auto"/>
-        <w:ind w:right="4650"/>
-        <w:rPr>
-          <w:b/>
-          <w:spacing w:val="-4"/>
-          <w:sz w:val="20"/>
-        </w:rPr>
-      </w:pPr>
-    </w:p>
-    <w:p>
-      <w:pPr>
-        <w:spacing w:before="1" w:line="252" w:lineRule="auto"/>
-        <w:ind w:right="4650"/>
-        <w:rPr>
-          <w:b/>
-          <w:spacing w:val="-4"/>
-          <w:sz w:val="20"/>
-        </w:rPr>
-      </w:pPr>
-    </w:p>
-    <w:p>
-      <w:pPr>
-        <w:spacing w:before="1" w:line="252" w:lineRule="auto"/>
-        <w:ind w:right="4650"/>
-        <w:rPr>
-          <w:b/>
-          <w:spacing w:val="-4"/>
-          <w:sz w:val="20"/>
-        </w:rPr>
-      </w:pPr>
-    </w:p>
-    <w:p>
-      <w:pPr>
-        <w:spacing w:before="1" w:line="252" w:lineRule="auto"/>
         <w:ind w:right="81"/>
         <w:rPr>
           <w:b/>
@@ -19535,10 +19124,9 @@
         <w:t xml:space="preserve"> </w:t>
       </w:r>
     </w:p>
-    <w:tbl xmlns:w="http://schemas.openxmlformats.org/wordprocessingml/2006/main">
+    <w:tbl>
       <w:tblPr>
         <w:tblW w:w="0" w:type="auto"/>
-        <w:tblLayout w:type="fixed"/>
         <w:tblBorders>
           <w:top w:val="single" w:sz="6" w:space="0" w:color="D0D7DE"/>
           <w:left w:val="single" w:sz="6" w:space="0" w:color="D0D7DE"/>
@@ -19547,7 +19135,8 @@
           <w:insideH w:val="single" w:sz="6" w:space="0" w:color="D0D7DE"/>
           <w:insideV w:val="single" w:sz="6" w:space="0" w:color="D0D7DE"/>
         </w:tblBorders>
-        <w:tblLook w:val="04A0" w:firstRow="1" w:lastRow="0" w:firstColumn="0" w:lastColumn="0" w:noHBand="1" w:noVBand="1"/>
+        <w:tblLayout w:type="fixed"/>
+        <w:tblLook w:val="0620" w:firstRow="1" w:lastRow="0" w:firstColumn="0" w:lastColumn="0" w:noHBand="1" w:noVBand="1"/>
       </w:tblPr>
       <w:tblGrid>
         <w:gridCol w:w="1538"/>
@@ -19672,7 +19261,21 @@
               <w:rPr>
                 <w:sz w:val="20"/>
               </w:rPr>
-              <w:t>{{#items}}{{tipo}}</w:t>
+              <w:t>{{#items</w:t>
+            </w:r>
+            <w:proofErr w:type="gramStart"/>
+            <w:r>
+              <w:rPr>
+                <w:sz w:val="20"/>
+              </w:rPr>
+              <w:t>}}{</w:t>
+            </w:r>
+            <w:proofErr w:type="gramEnd"/>
+            <w:r>
+              <w:rPr>
+                <w:sz w:val="20"/>
+              </w:rPr>
+              <w:t>{tipo}}</w:t>
             </w:r>
           </w:p>
         </w:tc>
@@ -19734,7 +19337,21 @@
               <w:rPr>
                 <w:sz w:val="20"/>
               </w:rPr>
-              <w:t>{{fechaFin}}{{/items}}</w:t>
+              <w:t>{{fechaFin</w:t>
+            </w:r>
+            <w:proofErr w:type="gramStart"/>
+            <w:r>
+              <w:rPr>
+                <w:sz w:val="20"/>
+              </w:rPr>
+              <w:t>}}{</w:t>
+            </w:r>
+            <w:proofErr w:type="gramEnd"/>
+            <w:r>
+              <w:rPr>
+                <w:sz w:val="20"/>
+              </w:rPr>
+              <w:t>{/items}}</w:t>
             </w:r>
           </w:p>
         </w:tc>

</xml_diff>

<commit_message>
Se crean los documentos para capital
</commit_message>
<xml_diff>
--- a/back/src/static/contratos/Anexo Técnico.docx
+++ b/back/src/static/contratos/Anexo Técnico.docx
@@ -962,7 +962,7 @@
                 </mc:Choice>
                 <mc:Fallback>
                   <w:pict>
-                    <v:group w14:anchorId="3100AED8" id="Group 3" o:spid="_x0000_s1026" style="position:absolute;margin-left:26.8pt;margin-top:-26.25pt;width:18.7pt;height:19.85pt;z-index:15729152;mso-wrap-distance-left:0;mso-wrap-distance-right:0" coordsize="237490,252095" o:gfxdata="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">
+                    <v:group w14:anchorId="788D8C67" id="Group 3" o:spid="_x0000_s1026" style="position:absolute;margin-left:26.8pt;margin-top:-26.25pt;width:18.7pt;height:19.85pt;z-index:15729152;mso-wrap-distance-left:0;mso-wrap-distance-right:0" coordsize="237490,252095" o:gfxdata="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">
                       <v:shapetype id="_x0000_t75" coordsize="21600,21600" o:spt="75" o:preferrelative="t" path="m@4@5l@4@11@9@11@9@5xe" filled="f" stroked="f">
                         <v:stroke joinstyle="miter"/>
                         <v:formulas>
@@ -1316,7 +1316,7 @@
           </mc:Choice>
           <mc:Fallback>
             <w:pict>
-              <v:shape w14:anchorId="3BF2F32B" id="Graphic 5" o:spid="_x0000_s1026" style="position:absolute;margin-left:85.1pt;margin-top:-176.85pt;width:441.45pt;height:164.55pt;z-index:-15995392;visibility:visible;mso-wrap-style:square;mso-wrap-distance-left:0;mso-wrap-distance-top:0;mso-wrap-distance-right:0;mso-wrap-distance-bottom:0;mso-position-horizontal:absolute;mso-position-horizontal-relative:page;mso-position-vertical:absolute;mso-position-vertical-relative:text;v-text-anchor:top" coordsize="5606415,2089785" o:gfxdata="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" path="m2802890,l,,,1475486r,614172l2802890,2089658r,-614172l2802890,xem5606237,l2802966,r,1475486l2802966,2089658r2803271,l5606237,1475486,5606237,xe" fillcolor="#d1d1d1" stroked="f">
+              <v:shape w14:anchorId="23B5167C" id="Graphic 5" o:spid="_x0000_s1026" style="position:absolute;margin-left:85.1pt;margin-top:-176.85pt;width:441.45pt;height:164.55pt;z-index:-15995392;visibility:visible;mso-wrap-style:square;mso-wrap-distance-left:0;mso-wrap-distance-top:0;mso-wrap-distance-right:0;mso-wrap-distance-bottom:0;mso-position-horizontal:absolute;mso-position-horizontal-relative:page;mso-position-vertical:absolute;mso-position-vertical-relative:text;v-text-anchor:top" coordsize="5606415,2089785" o:gfxdata="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" path="m2802890,l,,,1475486r,614172l2802890,2089658r,-614172l2802890,xem5606237,l2802966,r,1475486l2802966,2089658r2803271,l5606237,1475486,5606237,xe" fillcolor="#d1d1d1" stroked="f">
                 <v:path arrowok="t"/>
                 <w10:wrap anchorx="page"/>
               </v:shape>
@@ -18049,281 +18049,81 @@
     </w:p>
     <w:p>
       <w:pPr>
-        <w:pStyle w:val="Textoindependiente"/>
-        <w:spacing w:line="252" w:lineRule="auto"/>
-        <w:ind w:left="262" w:right="628"/>
         <w:jc w:val="both"/>
         <w:rPr>
-          <w:b/>
+          <w:rFonts w:cs="Calibri"/>
+          <w:sz w:val="20"/>
+          <w:szCs w:val="20"/>
         </w:rPr>
       </w:pPr>
       <w:r>
-        <w:t>Con</w:t>
-      </w:r>
-      <w:r>
-        <w:rPr>
-          <w:spacing w:val="-16"/>
-        </w:rPr>
-        <w:t xml:space="preserve"> </w:t>
-      </w:r>
-      <w:r>
-        <w:t>su</w:t>
-      </w:r>
-      <w:r>
-        <w:rPr>
-          <w:spacing w:val="-15"/>
-        </w:rPr>
-        <w:t xml:space="preserve"> </w:t>
-      </w:r>
-      <w:r>
-        <w:t>firma,</w:t>
-      </w:r>
-      <w:r>
-        <w:rPr>
-          <w:spacing w:val="-14"/>
-        </w:rPr>
-        <w:t xml:space="preserve"> </w:t>
-      </w:r>
-      <w:r>
-        <w:t>las</w:t>
-      </w:r>
-      <w:r>
-        <w:rPr>
-          <w:spacing w:val="-15"/>
-        </w:rPr>
-        <w:t xml:space="preserve"> </w:t>
-      </w:r>
-      <w:r>
-        <w:t>Partes</w:t>
-      </w:r>
-      <w:r>
-        <w:rPr>
-          <w:spacing w:val="-15"/>
-        </w:rPr>
-        <w:t xml:space="preserve"> </w:t>
-      </w:r>
-      <w:r>
-        <w:t>certifican</w:t>
-      </w:r>
-      <w:r>
-        <w:rPr>
-          <w:spacing w:val="-13"/>
-        </w:rPr>
-        <w:t xml:space="preserve"> </w:t>
-      </w:r>
-      <w:r>
-        <w:t>que</w:t>
-      </w:r>
-      <w:r>
-        <w:rPr>
-          <w:spacing w:val="-14"/>
-        </w:rPr>
-        <w:t xml:space="preserve"> </w:t>
-      </w:r>
-      <w:r>
-        <w:t>han</w:t>
-      </w:r>
-      <w:r>
-        <w:rPr>
-          <w:spacing w:val="-16"/>
-        </w:rPr>
-        <w:t xml:space="preserve"> </w:t>
-      </w:r>
-      <w:r>
-        <w:t>leído</w:t>
-      </w:r>
-      <w:r>
-        <w:rPr>
-          <w:spacing w:val="-15"/>
-        </w:rPr>
-        <w:t xml:space="preserve"> </w:t>
-      </w:r>
-      <w:r>
-        <w:t>la</w:t>
-      </w:r>
-      <w:r>
-        <w:rPr>
-          <w:spacing w:val="-15"/>
-        </w:rPr>
-        <w:t xml:space="preserve"> </w:t>
-      </w:r>
-      <w:r>
-        <w:t>totalidad</w:t>
-      </w:r>
-      <w:r>
-        <w:rPr>
-          <w:spacing w:val="-13"/>
-        </w:rPr>
-        <w:t xml:space="preserve"> </w:t>
-      </w:r>
-      <w:r>
-        <w:t>del</w:t>
-      </w:r>
-      <w:r>
-        <w:rPr>
-          <w:spacing w:val="-15"/>
-        </w:rPr>
-        <w:t xml:space="preserve"> </w:t>
-      </w:r>
-      <w:r>
-        <w:t>contenido</w:t>
-      </w:r>
-      <w:r>
-        <w:rPr>
-          <w:spacing w:val="-15"/>
-        </w:rPr>
-        <w:t xml:space="preserve"> </w:t>
-      </w:r>
-      <w:r>
-        <w:t>de</w:t>
-      </w:r>
-      <w:r>
-        <w:rPr>
-          <w:spacing w:val="-15"/>
-        </w:rPr>
-        <w:t xml:space="preserve"> </w:t>
-      </w:r>
-      <w:r>
-        <w:t>Anexo</w:t>
-      </w:r>
-      <w:r>
-        <w:rPr>
-          <w:spacing w:val="-14"/>
-        </w:rPr>
-        <w:t xml:space="preserve"> </w:t>
-      </w:r>
-      <w:r>
-        <w:t>Técnico,</w:t>
-      </w:r>
-      <w:r>
-        <w:rPr>
-          <w:spacing w:val="-16"/>
-        </w:rPr>
-        <w:t xml:space="preserve"> </w:t>
-      </w:r>
-      <w:r>
-        <w:t>con</w:t>
-      </w:r>
-      <w:r>
-        <w:rPr>
-          <w:spacing w:val="-15"/>
-        </w:rPr>
-        <w:t xml:space="preserve"> </w:t>
-      </w:r>
-      <w:r>
-        <w:t xml:space="preserve">la </w:t>
-      </w:r>
-      <w:r>
-        <w:rPr>
-          <w:spacing w:val="-6"/>
-        </w:rPr>
-        <w:t>antelación suficiente y que</w:t>
-      </w:r>
-      <w:r>
-        <w:rPr>
-          <w:spacing w:val="-7"/>
-        </w:rPr>
-        <w:t xml:space="preserve"> </w:t>
-      </w:r>
-      <w:r>
-        <w:rPr>
-          <w:spacing w:val="-6"/>
-        </w:rPr>
-        <w:t xml:space="preserve">en señal de aceptación lo firman de manera libre, consciente y voluntaria el </w:t>
-      </w:r>
-      <w:r>
-        <w:rPr>
-          <w:b/>
-        </w:rPr>
-        <w:t>23</w:t>
-      </w:r>
-      <w:r>
-        <w:rPr>
-          <w:b/>
-          <w:spacing w:val="-3"/>
-        </w:rPr>
-        <w:t xml:space="preserve"> </w:t>
-      </w:r>
-      <w:r>
-        <w:rPr>
-          <w:b/>
-        </w:rPr>
-        <w:t>del</w:t>
-      </w:r>
-      <w:r>
-        <w:rPr>
-          <w:b/>
-          <w:spacing w:val="-2"/>
-        </w:rPr>
-        <w:t xml:space="preserve"> </w:t>
-      </w:r>
-      <w:r>
-        <w:rPr>
-          <w:b/>
-        </w:rPr>
-        <w:t>mes</w:t>
-      </w:r>
-      <w:r>
-        <w:rPr>
-          <w:b/>
-          <w:spacing w:val="-2"/>
-        </w:rPr>
-        <w:t xml:space="preserve"> </w:t>
-      </w:r>
-      <w:r>
-        <w:rPr>
-          <w:b/>
-        </w:rPr>
-        <w:t>de</w:t>
-      </w:r>
-      <w:r>
-        <w:rPr>
-          <w:b/>
-          <w:spacing w:val="-2"/>
-        </w:rPr>
-        <w:t xml:space="preserve"> </w:t>
-      </w:r>
-      <w:r>
-        <w:rPr>
-          <w:b/>
-        </w:rPr>
-        <w:t>marzo</w:t>
-      </w:r>
-      <w:r>
-        <w:rPr>
-          <w:b/>
-          <w:spacing w:val="-2"/>
-        </w:rPr>
-        <w:t xml:space="preserve"> </w:t>
-      </w:r>
-      <w:r>
-        <w:rPr>
-          <w:b/>
-        </w:rPr>
-        <w:t>2026</w:t>
-      </w:r>
-    </w:p>
-    <w:p>
-      <w:pPr>
-        <w:pStyle w:val="Textoindependiente"/>
-        <w:spacing w:line="252" w:lineRule="auto"/>
-        <w:jc w:val="both"/>
-        <w:rPr>
-          <w:b/>
-        </w:rPr>
-        <w:sectPr>
-          <w:pgSz w:w="12240" w:h="15840"/>
-          <w:pgMar w:top="920" w:right="1080" w:bottom="880" w:left="1440" w:header="0" w:footer="685" w:gutter="0"/>
-          <w:cols w:space="720"/>
-        </w:sectPr>
-      </w:pPr>
+        <w:rPr>
+          <w:rFonts w:cs="Calibri"/>
+          <w:sz w:val="20"/>
+          <w:szCs w:val="20"/>
+        </w:rPr>
+        <w:t>Con su firma, las Partes certifican que han leído la totalidad del contenido de Anexo Técnico, con la antelación suficiente y que en señal de aceptación lo firman de manera libre, consciente y voluntaria el {</w:t>
+      </w:r>
+      <w:proofErr w:type="spellStart"/>
+      <w:r>
+        <w:rPr>
+          <w:rFonts w:cs="Calibri"/>
+          <w:sz w:val="20"/>
+          <w:szCs w:val="20"/>
+        </w:rPr>
+        <w:t>FechaInicioDia</w:t>
+      </w:r>
+      <w:proofErr w:type="spellEnd"/>
+      <w:r>
+        <w:rPr>
+          <w:rFonts w:cs="Calibri"/>
+          <w:sz w:val="20"/>
+          <w:szCs w:val="20"/>
+        </w:rPr>
+        <w:t>} del {</w:t>
+      </w:r>
+      <w:proofErr w:type="spellStart"/>
+      <w:r>
+        <w:rPr>
+          <w:rFonts w:cs="Calibri"/>
+          <w:sz w:val="20"/>
+          <w:szCs w:val="20"/>
+        </w:rPr>
+        <w:t>FechaInicioMesTexto</w:t>
+      </w:r>
+      <w:proofErr w:type="spellEnd"/>
+      <w:r>
+        <w:rPr>
+          <w:rFonts w:cs="Calibri"/>
+          <w:sz w:val="20"/>
+          <w:szCs w:val="20"/>
+        </w:rPr>
+        <w:t>} de {</w:t>
+      </w:r>
+      <w:proofErr w:type="spellStart"/>
+      <w:r>
+        <w:rPr>
+          <w:rFonts w:cs="Calibri"/>
+          <w:sz w:val="20"/>
+          <w:szCs w:val="20"/>
+        </w:rPr>
+        <w:t>FechaInicioAnio</w:t>
+      </w:r>
+      <w:proofErr w:type="spellEnd"/>
+      <w:r>
+        <w:rPr>
+          <w:rFonts w:cs="Calibri"/>
+          <w:sz w:val="20"/>
+          <w:szCs w:val="20"/>
+        </w:rPr>
+        <w:t>}</w:t>
+      </w:r>
     </w:p>
     <w:p>
       <w:pPr>
         <w:spacing w:before="1" w:line="280" w:lineRule="auto"/>
         <w:ind w:left="720"/>
         <w:sectPr>
-          <w:type w:val="continuous"/>
           <w:pgSz w:w="12240" w:h="15840"/>
           <w:pgMar w:top="1640" w:right="1080" w:bottom="880" w:left="1440" w:header="0" w:footer="685" w:gutter="0"/>
           <w:cols w:space="754"/>

</xml_diff>